<commit_message>
Changes to the kiosk mode, keyboard, demo and crio modes
</commit_message>
<xml_diff>
--- a/docs/CARE2.0-UI-Command-Guide.docx
+++ b/docs/CARE2.0-UI-Command-Guide.docx
@@ -670,6 +670,18 @@
           <w:color w:val="5F6B61"/>
         </w:rPr>
         <w:t xml:space="preserve">12. Publish on GitHub Pages for testing</w:t>
+      </w:r>
+    </w:p>
+    <w:p>
+      <w:pPr>
+        <w:spacing w:after="40"/>
+        <w:ind w:left="240"/>
+      </w:pPr>
+      <w:r>
+        <w:rPr>
+          <w:color w:val="5F6B61"/>
+        </w:rPr>
+        <w:t xml:space="preserve">13. API server</w:t>
       </w:r>
     </w:p>
     <w:p>
@@ -1086,7 +1098,7 @@
                 <w:sz w:val="20"/>
                 <w:szCs w:val="20"/>
               </w:rPr>
-              <w:t xml:space="preserve">npm run preview</w:t>
+              <w:t xml:space="preserve">npm run demo</w:t>
             </w:r>
           </w:p>
         </w:tc>
@@ -1109,7 +1121,7 @@
           </w:tcPr>
           <w:p>
             <w:r>
-              <w:t xml:space="preserve">Serves the built app from dist</w:t>
+              <w:t xml:space="preserve">Builds the demo version (simulator, no server needed) and serves it</w:t>
             </w:r>
           </w:p>
         </w:tc>
@@ -1138,7 +1150,7 @@
                 <w:sz w:val="20"/>
                 <w:szCs w:val="20"/>
               </w:rPr>
-              <w:t xml:space="preserve">http://192.168.0.7:4173</w:t>
+              <w:t xml:space="preserve">http://192.168.0.7:4175</w:t>
             </w:r>
           </w:p>
         </w:tc>
@@ -1171,7 +1183,7 @@
                 <w:sz w:val="20"/>
                 <w:szCs w:val="20"/>
               </w:rPr>
-              <w:t xml:space="preserve">npm run record</w:t>
+              <w:t xml:space="preserve">npm run build:demo</w:t>
             </w:r>
           </w:p>
         </w:tc>
@@ -1193,7 +1205,7 @@
           </w:tcPr>
           <w:p>
             <w:r>
-              <w:t xml:space="preserve">Records the scripted walkthrough video (needs preview running)</w:t>
+              <w:t xml:space="preserve">Builds the demo version only (copy the folder to any web server)</w:t>
             </w:r>
           </w:p>
         </w:tc>
@@ -1221,7 +1233,7 @@
                 <w:sz w:val="20"/>
                 <w:szCs w:val="20"/>
               </w:rPr>
-              <w:t xml:space="preserve">recordings\CARE2.0-UI-Walkthrough.mp4</w:t>
+              <w:t xml:space="preserve">dist-demo\</w:t>
             </w:r>
           </w:p>
         </w:tc>
@@ -1255,7 +1267,7 @@
                 <w:sz w:val="20"/>
                 <w:szCs w:val="20"/>
               </w:rPr>
-              <w:t xml:space="preserve">npm run export-loader</w:t>
+              <w:t xml:space="preserve">npm run preview</w:t>
             </w:r>
           </w:p>
         </w:tc>
@@ -1278,7 +1290,7 @@
           </w:tcPr>
           <w:p>
             <w:r>
-              <w:t xml:space="preserve">Exports the loading animation</w:t>
+              <w:t xml:space="preserve">Serves the built app from dist</w:t>
             </w:r>
           </w:p>
         </w:tc>
@@ -1307,19 +1319,7 @@
                 <w:sz w:val="20"/>
                 <w:szCs w:val="20"/>
               </w:rPr>
-              <w:t xml:space="preserve">exports\*.svg</w:t>
-            </w:r>
-            <w:r>
-              <w:t xml:space="preserve">, </w:t>
-            </w:r>
-            <w:r>
-              <w:rPr>
-                <w:rFonts w:ascii="Consolas" w:cs="Consolas" w:eastAsia="Consolas" w:hAnsi="Consolas"/>
-                <w:color w:val="254229"/>
-                <w:sz w:val="20"/>
-                <w:szCs w:val="20"/>
-              </w:rPr>
-              <w:t xml:space="preserve">exports\*.gif</w:t>
+              <w:t xml:space="preserve">http://192.168.0.7:4173</w:t>
             </w:r>
           </w:p>
         </w:tc>
@@ -1352,7 +1352,7 @@
                 <w:sz w:val="20"/>
                 <w:szCs w:val="20"/>
               </w:rPr>
-              <w:t xml:space="preserve">npm run test:keyboard</w:t>
+              <w:t xml:space="preserve">npm run record</w:t>
             </w:r>
           </w:p>
         </w:tc>
@@ -1374,7 +1374,7 @@
           </w:tcPr>
           <w:p>
             <w:r>
-              <w:t xml:space="preserve">Checks the UI keeps its size when a tablet keyboard opens (needs preview running)</w:t>
+              <w:t xml:space="preserve">Records the scripted walkthrough video (needs preview running)</w:t>
             </w:r>
           </w:p>
         </w:tc>
@@ -1396,7 +1396,13 @@
           </w:tcPr>
           <w:p>
             <w:r>
-              <w:t xml:space="preserve">PASS / FAIL</w:t>
+              <w:rPr>
+                <w:rFonts w:ascii="Consolas" w:cs="Consolas" w:eastAsia="Consolas" w:hAnsi="Consolas"/>
+                <w:color w:val="254229"/>
+                <w:sz w:val="20"/>
+                <w:szCs w:val="20"/>
+              </w:rPr>
+              <w:t xml:space="preserve">recordings\CARE2.0-UI-Walkthrough.mp4</w:t>
             </w:r>
           </w:p>
         </w:tc>
@@ -1430,7 +1436,7 @@
                 <w:sz w:val="20"/>
                 <w:szCs w:val="20"/>
               </w:rPr>
-              <w:t xml:space="preserve">npm run test:fullscreen</w:t>
+              <w:t xml:space="preserve">npm run export-loader</w:t>
             </w:r>
           </w:p>
         </w:tc>
@@ -1453,7 +1459,7 @@
           </w:tcPr>
           <w:p>
             <w:r>
-              <w:t xml:space="preserve">Checks full screen: default on, restored after the keyboard, Exit full screen remembered (needs preview running)</w:t>
+              <w:t xml:space="preserve">Exports the loading animation</w:t>
             </w:r>
           </w:p>
         </w:tc>
@@ -1476,7 +1482,25 @@
           </w:tcPr>
           <w:p>
             <w:r>
-              <w:t xml:space="preserve">PASS / FAIL</w:t>
+              <w:rPr>
+                <w:rFonts w:ascii="Consolas" w:cs="Consolas" w:eastAsia="Consolas" w:hAnsi="Consolas"/>
+                <w:color w:val="254229"/>
+                <w:sz w:val="20"/>
+                <w:szCs w:val="20"/>
+              </w:rPr>
+              <w:t xml:space="preserve">exports\*.svg</w:t>
+            </w:r>
+            <w:r>
+              <w:t xml:space="preserve">, </w:t>
+            </w:r>
+            <w:r>
+              <w:rPr>
+                <w:rFonts w:ascii="Consolas" w:cs="Consolas" w:eastAsia="Consolas" w:hAnsi="Consolas"/>
+                <w:color w:val="254229"/>
+                <w:sz w:val="20"/>
+                <w:szCs w:val="20"/>
+              </w:rPr>
+              <w:t xml:space="preserve">exports\*.gif</w:t>
             </w:r>
           </w:p>
         </w:tc>
@@ -1509,7 +1533,7 @@
                 <w:sz w:val="20"/>
                 <w:szCs w:val="20"/>
               </w:rPr>
-              <w:t xml:space="preserve">git push</w:t>
+              <w:t xml:space="preserve">npm run test:keyboard</w:t>
             </w:r>
           </w:p>
         </w:tc>
@@ -1531,7 +1555,7 @@
           </w:tcPr>
           <w:p>
             <w:r>
-              <w:t xml:space="preserve">Publishes the latest code to GitHub Pages (after the one-time setup in section 12)</w:t>
+              <w:t xml:space="preserve">Checks the UI keeps its size when a tablet keyboard opens (needs preview running)</w:t>
             </w:r>
           </w:p>
         </w:tc>
@@ -1553,13 +1577,7 @@
           </w:tcPr>
           <w:p>
             <w:r>
-              <w:rPr>
-                <w:rFonts w:ascii="Consolas" w:cs="Consolas" w:eastAsia="Consolas" w:hAnsi="Consolas"/>
-                <w:color w:val="254229"/>
-                <w:sz w:val="20"/>
-                <w:szCs w:val="20"/>
-              </w:rPr>
-              <w:t xml:space="preserve">https://&lt;user&gt;.github.io/care-ui/</w:t>
+              <w:t xml:space="preserve">PASS / FAIL</w:t>
             </w:r>
           </w:p>
         </w:tc>
@@ -1593,6 +1611,254 @@
                 <w:sz w:val="20"/>
                 <w:szCs w:val="20"/>
               </w:rPr>
+              <w:t xml:space="preserve">npm run test:fullscreen</w:t>
+            </w:r>
+          </w:p>
+        </w:tc>
+        <w:tc>
+          <w:tcPr>
+            <w:tcW w:type="dxa" w:w="3900"/>
+            <w:tcBorders>
+              <w:top w:val="single" w:color="C9D8C3" w:sz="4"/>
+              <w:left w:val="single" w:color="C9D8C3" w:sz="4"/>
+              <w:bottom w:val="single" w:color="C9D8C3" w:sz="4"/>
+              <w:right w:val="single" w:color="C9D8C3" w:sz="4"/>
+            </w:tcBorders>
+            <w:shd w:fill="F6F9F4" w:color="auto" w:val="clear"/>
+            <w:tcMar>
+              <w:top w:type="dxa" w:w="70"/>
+              <w:left w:type="dxa" w:w="110"/>
+              <w:bottom w:type="dxa" w:w="70"/>
+              <w:right w:type="dxa" w:w="110"/>
+            </w:tcMar>
+          </w:tcPr>
+          <w:p>
+            <w:r>
+              <w:t xml:space="preserve">Checks kiosk mode and the in-app keyboard: full screen kept while typing, right-click and dev-tool keys blocked (needs preview running)</w:t>
+            </w:r>
+          </w:p>
+        </w:tc>
+        <w:tc>
+          <w:tcPr>
+            <w:tcW w:type="dxa" w:w="2626"/>
+            <w:tcBorders>
+              <w:top w:val="single" w:color="C9D8C3" w:sz="4"/>
+              <w:left w:val="single" w:color="C9D8C3" w:sz="4"/>
+              <w:bottom w:val="single" w:color="C9D8C3" w:sz="4"/>
+              <w:right w:val="single" w:color="C9D8C3" w:sz="4"/>
+            </w:tcBorders>
+            <w:shd w:fill="F6F9F4" w:color="auto" w:val="clear"/>
+            <w:tcMar>
+              <w:top w:type="dxa" w:w="70"/>
+              <w:left w:type="dxa" w:w="110"/>
+              <w:bottom w:type="dxa" w:w="70"/>
+              <w:right w:type="dxa" w:w="110"/>
+            </w:tcMar>
+          </w:tcPr>
+          <w:p>
+            <w:r>
+              <w:t xml:space="preserve">PASS / FAIL</w:t>
+            </w:r>
+          </w:p>
+        </w:tc>
+      </w:tr>
+      <w:tr>
+        <w:trPr>
+          <w:cantSplit/>
+        </w:trPr>
+        <w:tc>
+          <w:tcPr>
+            <w:tcW w:type="dxa" w:w="2500"/>
+            <w:tcBorders>
+              <w:top w:val="single" w:color="C9D8C3" w:sz="4"/>
+              <w:left w:val="single" w:color="C9D8C3" w:sz="4"/>
+              <w:bottom w:val="single" w:color="C9D8C3" w:sz="4"/>
+              <w:right w:val="single" w:color="C9D8C3" w:sz="4"/>
+            </w:tcBorders>
+            <w:tcMar>
+              <w:top w:type="dxa" w:w="70"/>
+              <w:left w:type="dxa" w:w="110"/>
+              <w:bottom w:type="dxa" w:w="70"/>
+              <w:right w:type="dxa" w:w="110"/>
+            </w:tcMar>
+          </w:tcPr>
+          <w:p>
+            <w:r>
+              <w:rPr>
+                <w:rFonts w:ascii="Consolas" w:cs="Consolas" w:eastAsia="Consolas" w:hAnsi="Consolas"/>
+                <w:color w:val="254229"/>
+                <w:sz w:val="20"/>
+                <w:szCs w:val="20"/>
+              </w:rPr>
+              <w:t xml:space="preserve">python server/app.py</w:t>
+            </w:r>
+          </w:p>
+        </w:tc>
+        <w:tc>
+          <w:tcPr>
+            <w:tcW w:type="dxa" w:w="3900"/>
+            <w:tcBorders>
+              <w:top w:val="single" w:color="C9D8C3" w:sz="4"/>
+              <w:left w:val="single" w:color="C9D8C3" w:sz="4"/>
+              <w:bottom w:val="single" w:color="C9D8C3" w:sz="4"/>
+              <w:right w:val="single" w:color="C9D8C3" w:sz="4"/>
+            </w:tcBorders>
+            <w:tcMar>
+              <w:top w:type="dxa" w:w="70"/>
+              <w:left w:type="dxa" w:w="110"/>
+              <w:bottom w:type="dxa" w:w="70"/>
+              <w:right w:type="dxa" w:w="110"/>
+            </w:tcMar>
+          </w:tcPr>
+          <w:p>
+            <w:r>
+              <w:t xml:space="preserve">Starts the API server the UI gets its data from (start it before the UI)</w:t>
+            </w:r>
+          </w:p>
+        </w:tc>
+        <w:tc>
+          <w:tcPr>
+            <w:tcW w:type="dxa" w:w="2626"/>
+            <w:tcBorders>
+              <w:top w:val="single" w:color="C9D8C3" w:sz="4"/>
+              <w:left w:val="single" w:color="C9D8C3" w:sz="4"/>
+              <w:bottom w:val="single" w:color="C9D8C3" w:sz="4"/>
+              <w:right w:val="single" w:color="C9D8C3" w:sz="4"/>
+            </w:tcBorders>
+            <w:tcMar>
+              <w:top w:type="dxa" w:w="70"/>
+              <w:left w:type="dxa" w:w="110"/>
+              <w:bottom w:type="dxa" w:w="70"/>
+              <w:right w:type="dxa" w:w="110"/>
+            </w:tcMar>
+          </w:tcPr>
+          <w:p>
+            <w:r>
+              <w:rPr>
+                <w:rFonts w:ascii="Consolas" w:cs="Consolas" w:eastAsia="Consolas" w:hAnsi="Consolas"/>
+                <w:color w:val="254229"/>
+                <w:sz w:val="20"/>
+                <w:szCs w:val="20"/>
+              </w:rPr>
+              <w:t xml:space="preserve">http://192.168.0.7:8000</w:t>
+            </w:r>
+          </w:p>
+        </w:tc>
+      </w:tr>
+      <w:tr>
+        <w:trPr>
+          <w:cantSplit/>
+        </w:trPr>
+        <w:tc>
+          <w:tcPr>
+            <w:tcW w:type="dxa" w:w="2500"/>
+            <w:tcBorders>
+              <w:top w:val="single" w:color="C9D8C3" w:sz="4"/>
+              <w:left w:val="single" w:color="C9D8C3" w:sz="4"/>
+              <w:bottom w:val="single" w:color="C9D8C3" w:sz="4"/>
+              <w:right w:val="single" w:color="C9D8C3" w:sz="4"/>
+            </w:tcBorders>
+            <w:shd w:fill="F6F9F4" w:color="auto" w:val="clear"/>
+            <w:tcMar>
+              <w:top w:type="dxa" w:w="70"/>
+              <w:left w:type="dxa" w:w="110"/>
+              <w:bottom w:type="dxa" w:w="70"/>
+              <w:right w:type="dxa" w:w="110"/>
+            </w:tcMar>
+          </w:tcPr>
+          <w:p>
+            <w:r>
+              <w:rPr>
+                <w:rFonts w:ascii="Consolas" w:cs="Consolas" w:eastAsia="Consolas" w:hAnsi="Consolas"/>
+                <w:color w:val="254229"/>
+                <w:sz w:val="20"/>
+                <w:szCs w:val="20"/>
+              </w:rPr>
+              <w:t xml:space="preserve">git push</w:t>
+            </w:r>
+          </w:p>
+        </w:tc>
+        <w:tc>
+          <w:tcPr>
+            <w:tcW w:type="dxa" w:w="3900"/>
+            <w:tcBorders>
+              <w:top w:val="single" w:color="C9D8C3" w:sz="4"/>
+              <w:left w:val="single" w:color="C9D8C3" w:sz="4"/>
+              <w:bottom w:val="single" w:color="C9D8C3" w:sz="4"/>
+              <w:right w:val="single" w:color="C9D8C3" w:sz="4"/>
+            </w:tcBorders>
+            <w:shd w:fill="F6F9F4" w:color="auto" w:val="clear"/>
+            <w:tcMar>
+              <w:top w:type="dxa" w:w="70"/>
+              <w:left w:type="dxa" w:w="110"/>
+              <w:bottom w:type="dxa" w:w="70"/>
+              <w:right w:type="dxa" w:w="110"/>
+            </w:tcMar>
+          </w:tcPr>
+          <w:p>
+            <w:r>
+              <w:t xml:space="preserve">Publishes the latest code to GitHub Pages (after the one-time setup in section 12)</w:t>
+            </w:r>
+          </w:p>
+        </w:tc>
+        <w:tc>
+          <w:tcPr>
+            <w:tcW w:type="dxa" w:w="2626"/>
+            <w:tcBorders>
+              <w:top w:val="single" w:color="C9D8C3" w:sz="4"/>
+              <w:left w:val="single" w:color="C9D8C3" w:sz="4"/>
+              <w:bottom w:val="single" w:color="C9D8C3" w:sz="4"/>
+              <w:right w:val="single" w:color="C9D8C3" w:sz="4"/>
+            </w:tcBorders>
+            <w:shd w:fill="F6F9F4" w:color="auto" w:val="clear"/>
+            <w:tcMar>
+              <w:top w:type="dxa" w:w="70"/>
+              <w:left w:type="dxa" w:w="110"/>
+              <w:bottom w:type="dxa" w:w="70"/>
+              <w:right w:type="dxa" w:w="110"/>
+            </w:tcMar>
+          </w:tcPr>
+          <w:p>
+            <w:r>
+              <w:rPr>
+                <w:rFonts w:ascii="Consolas" w:cs="Consolas" w:eastAsia="Consolas" w:hAnsi="Consolas"/>
+                <w:color w:val="254229"/>
+                <w:sz w:val="20"/>
+                <w:szCs w:val="20"/>
+              </w:rPr>
+              <w:t xml:space="preserve">https://&lt;user&gt;.github.io/care-ui/</w:t>
+            </w:r>
+          </w:p>
+        </w:tc>
+      </w:tr>
+      <w:tr>
+        <w:trPr>
+          <w:cantSplit/>
+        </w:trPr>
+        <w:tc>
+          <w:tcPr>
+            <w:tcW w:type="dxa" w:w="2500"/>
+            <w:tcBorders>
+              <w:top w:val="single" w:color="C9D8C3" w:sz="4"/>
+              <w:left w:val="single" w:color="C9D8C3" w:sz="4"/>
+              <w:bottom w:val="single" w:color="C9D8C3" w:sz="4"/>
+              <w:right w:val="single" w:color="C9D8C3" w:sz="4"/>
+            </w:tcBorders>
+            <w:tcMar>
+              <w:top w:type="dxa" w:w="70"/>
+              <w:left w:type="dxa" w:w="110"/>
+              <w:bottom w:type="dxa" w:w="70"/>
+              <w:right w:type="dxa" w:w="110"/>
+            </w:tcMar>
+          </w:tcPr>
+          <w:p>
+            <w:r>
+              <w:rPr>
+                <w:rFonts w:ascii="Consolas" w:cs="Consolas" w:eastAsia="Consolas" w:hAnsi="Consolas"/>
+                <w:color w:val="254229"/>
+                <w:sz w:val="20"/>
+                <w:szCs w:val="20"/>
+              </w:rPr>
               <w:t xml:space="preserve">Ctrl + C</w:t>
             </w:r>
           </w:p>
@@ -1606,7 +1872,6 @@
               <w:bottom w:val="single" w:color="C9D8C3" w:sz="4"/>
               <w:right w:val="single" w:color="C9D8C3" w:sz="4"/>
             </w:tcBorders>
-            <w:shd w:fill="F6F9F4" w:color="auto" w:val="clear"/>
             <w:tcMar>
               <w:top w:type="dxa" w:w="70"/>
               <w:left w:type="dxa" w:w="110"/>
@@ -1629,7 +1894,6 @@
               <w:bottom w:val="single" w:color="C9D8C3" w:sz="4"/>
               <w:right w:val="single" w:color="C9D8C3" w:sz="4"/>
             </w:tcBorders>
-            <w:shd w:fill="F6F9F4" w:color="auto" w:val="clear"/>
             <w:tcMar>
               <w:top w:type="dxa" w:w="70"/>
               <w:left w:type="dxa" w:w="110"/>
@@ -1878,7 +2142,7 @@
           </w:tcPr>
           <w:p>
             <w:r>
-              <w:t xml:space="preserve">Google Chrome</w:t>
+              <w:t xml:space="preserve">Python 3.9 or newer</w:t>
             </w:r>
           </w:p>
         </w:tc>
@@ -1901,7 +2165,19 @@
           </w:tcPr>
           <w:p>
             <w:r>
-              <w:t xml:space="preserve">Recording the video and exporting the GIF (no extra browser download)</w:t>
+              <w:t xml:space="preserve">The API server (</w:t>
+            </w:r>
+            <w:r>
+              <w:rPr>
+                <w:rFonts w:ascii="Consolas" w:cs="Consolas" w:eastAsia="Consolas" w:hAnsi="Consolas"/>
+                <w:color w:val="254229"/>
+                <w:sz w:val="20"/>
+                <w:szCs w:val="20"/>
+              </w:rPr>
+              <w:t xml:space="preserve">server/app.py</w:t>
+            </w:r>
+            <w:r>
+              <w:t xml:space="preserve">, no extra packages)</w:t>
             </w:r>
           </w:p>
         </w:tc>
@@ -1924,7 +2200,13 @@
           </w:tcPr>
           <w:p>
             <w:r>
-              <w:t xml:space="preserve">—</w:t>
+              <w:rPr>
+                <w:rFonts w:ascii="Consolas" w:cs="Consolas" w:eastAsia="Consolas" w:hAnsi="Consolas"/>
+                <w:color w:val="254229"/>
+                <w:sz w:val="20"/>
+                <w:szCs w:val="20"/>
+              </w:rPr>
+              <w:t xml:space="preserve">python --version</w:t>
             </w:r>
           </w:p>
         </w:tc>
@@ -1951,6 +2233,78 @@
           </w:tcPr>
           <w:p>
             <w:r>
+              <w:t xml:space="preserve">Google Chrome</w:t>
+            </w:r>
+          </w:p>
+        </w:tc>
+        <w:tc>
+          <w:tcPr>
+            <w:tcW w:type="dxa" w:w="3900"/>
+            <w:tcBorders>
+              <w:top w:val="single" w:color="C9D8C3" w:sz="4"/>
+              <w:left w:val="single" w:color="C9D8C3" w:sz="4"/>
+              <w:bottom w:val="single" w:color="C9D8C3" w:sz="4"/>
+              <w:right w:val="single" w:color="C9D8C3" w:sz="4"/>
+            </w:tcBorders>
+            <w:tcMar>
+              <w:top w:type="dxa" w:w="70"/>
+              <w:left w:type="dxa" w:w="110"/>
+              <w:bottom w:type="dxa" w:w="70"/>
+              <w:right w:type="dxa" w:w="110"/>
+            </w:tcMar>
+          </w:tcPr>
+          <w:p>
+            <w:r>
+              <w:t xml:space="preserve">Recording the video and exporting the GIF (no extra browser download)</w:t>
+            </w:r>
+          </w:p>
+        </w:tc>
+        <w:tc>
+          <w:tcPr>
+            <w:tcW w:type="dxa" w:w="1926"/>
+            <w:tcBorders>
+              <w:top w:val="single" w:color="C9D8C3" w:sz="4"/>
+              <w:left w:val="single" w:color="C9D8C3" w:sz="4"/>
+              <w:bottom w:val="single" w:color="C9D8C3" w:sz="4"/>
+              <w:right w:val="single" w:color="C9D8C3" w:sz="4"/>
+            </w:tcBorders>
+            <w:tcMar>
+              <w:top w:type="dxa" w:w="70"/>
+              <w:left w:type="dxa" w:w="110"/>
+              <w:bottom w:type="dxa" w:w="70"/>
+              <w:right w:type="dxa" w:w="110"/>
+            </w:tcMar>
+          </w:tcPr>
+          <w:p>
+            <w:r>
+              <w:t xml:space="preserve">—</w:t>
+            </w:r>
+          </w:p>
+        </w:tc>
+      </w:tr>
+      <w:tr>
+        <w:trPr>
+          <w:cantSplit/>
+        </w:trPr>
+        <w:tc>
+          <w:tcPr>
+            <w:tcW w:type="dxa" w:w="3200"/>
+            <w:tcBorders>
+              <w:top w:val="single" w:color="C9D8C3" w:sz="4"/>
+              <w:left w:val="single" w:color="C9D8C3" w:sz="4"/>
+              <w:bottom w:val="single" w:color="C9D8C3" w:sz="4"/>
+              <w:right w:val="single" w:color="C9D8C3" w:sz="4"/>
+            </w:tcBorders>
+            <w:shd w:fill="F6F9F4" w:color="auto" w:val="clear"/>
+            <w:tcMar>
+              <w:top w:type="dxa" w:w="70"/>
+              <w:left w:type="dxa" w:w="110"/>
+              <w:bottom w:type="dxa" w:w="70"/>
+              <w:right w:type="dxa" w:w="110"/>
+            </w:tcMar>
+          </w:tcPr>
+          <w:p>
+            <w:r>
               <w:t xml:space="preserve">Python 3 with opencv-python and Pillow</w:t>
             </w:r>
           </w:p>
@@ -1964,6 +2318,7 @@
               <w:bottom w:val="single" w:color="C9D8C3" w:sz="4"/>
               <w:right w:val="single" w:color="C9D8C3" w:sz="4"/>
             </w:tcBorders>
+            <w:shd w:fill="F6F9F4" w:color="auto" w:val="clear"/>
             <w:tcMar>
               <w:top w:type="dxa" w:w="70"/>
               <w:left w:type="dxa" w:w="110"/>
@@ -1986,6 +2341,7 @@
               <w:bottom w:val="single" w:color="C9D8C3" w:sz="4"/>
               <w:right w:val="single" w:color="C9D8C3" w:sz="4"/>
             </w:tcBorders>
+            <w:shd w:fill="F6F9F4" w:color="auto" w:val="clear"/>
             <w:tcMar>
               <w:top w:type="dxa" w:w="70"/>
               <w:left w:type="dxa" w:w="110"/>
@@ -2170,7 +2526,23 @@
         <w:spacing w:after="120"/>
       </w:pPr>
       <w:r>
-        <w:t xml:space="preserve">Starts a live-reloading server. Saving a source file updates the page instantly.</w:t>
+        <w:t xml:space="preserve">First start the API server in its own terminal and leave it running (the UI gets all its data from it, see section 13):</w:t>
+      </w:r>
+    </w:p>
+    <w:p>
+      <w:pPr>
+        <w:keepNext/>
+        <w:spacing w:after="0" w:before="60"/>
+      </w:pPr>
+      <w:r>
+        <w:rPr>
+          <w:i/>
+          <w:iCs/>
+          <w:color w:val="5F6B61"/>
+          <w:sz w:val="17"/>
+          <w:szCs w:val="17"/>
+        </w:rPr>
+        <w:t xml:space="preserve">Terminal 1</w:t>
       </w:r>
     </w:p>
     <w:p>
@@ -2194,7 +2566,7 @@
           <w:sz w:val="19"/>
           <w:szCs w:val="19"/>
         </w:rPr>
-        <w:t xml:space="preserve">npm run dev</w:t>
+        <w:t xml:space="preserve">python server/app.py</w:t>
       </w:r>
     </w:p>
     <w:p>
@@ -2202,502 +2574,7 @@
         <w:spacing w:after="120"/>
       </w:pPr>
       <w:r>
-        <w:t xml:space="preserve">Vite prints the addresses it is listening on, for example:</w:t>
-      </w:r>
-    </w:p>
-    <w:p>
-      <w:pPr>
-        <w:keepNext/>
-        <w:keepLines/>
-        <w:pBdr>
-          <w:top w:val="single" w:color="C9D8C3" w:sz="6" w:space="4"/>
-          <w:left w:val="single" w:color="639850" w:sz="18" w:space="6"/>
-          <w:right w:val="single" w:color="C9D8C3" w:sz="6" w:space="4"/>
-        </w:pBdr>
-        <w:shd w:fill="F3F6F1" w:color="auto" w:val="clear"/>
-        <w:spacing w:after="0" w:before="40" w:line="276"/>
-        <w:ind w:left="120" w:right="120"/>
-      </w:pPr>
-      <w:r>
-        <w:rPr>
-          <w:rFonts w:ascii="Consolas" w:cs="Consolas" w:eastAsia="Consolas" w:hAnsi="Consolas"/>
-          <w:color w:val="1B2E1D"/>
-          <w:sz w:val="19"/>
-          <w:szCs w:val="19"/>
-        </w:rPr>
-        <w:t xml:space="preserve">  VITE ready</w:t>
-      </w:r>
-    </w:p>
-    <w:p>
-      <w:pPr>
-        <w:keepNext/>
-        <w:keepLines/>
-        <w:pBdr>
-          <w:left w:val="single" w:color="639850" w:sz="18" w:space="6"/>
-          <w:right w:val="single" w:color="C9D8C3" w:sz="6" w:space="4"/>
-        </w:pBdr>
-        <w:shd w:fill="F3F6F1" w:color="auto" w:val="clear"/>
-        <w:spacing w:after="0" w:before="0" w:line="276"/>
-        <w:ind w:left="120" w:right="120"/>
-      </w:pPr>
-      <w:r>
-        <w:rPr>
-          <w:rFonts w:ascii="Consolas" w:cs="Consolas" w:eastAsia="Consolas" w:hAnsi="Consolas"/>
-          <w:color w:val="1B2E1D"/>
-          <w:sz w:val="19"/>
-          <w:szCs w:val="19"/>
-        </w:rPr>
-        <w:t xml:space="preserve">  ➜  Local:   http://localhost:5173/</w:t>
-      </w:r>
-    </w:p>
-    <w:p>
-      <w:pPr>
-        <w:keepNext w:val="false"/>
-        <w:keepLines/>
-        <w:pBdr>
-          <w:bottom w:val="single" w:color="C9D8C3" w:sz="6" w:space="4"/>
-          <w:left w:val="single" w:color="639850" w:sz="18" w:space="6"/>
-          <w:right w:val="single" w:color="C9D8C3" w:sz="6" w:space="4"/>
-        </w:pBdr>
-        <w:shd w:fill="F3F6F1" w:color="auto" w:val="clear"/>
-        <w:spacing w:after="160" w:before="0" w:line="276"/>
-        <w:ind w:left="120" w:right="120"/>
-      </w:pPr>
-      <w:r>
-        <w:rPr>
-          <w:rFonts w:ascii="Consolas" w:cs="Consolas" w:eastAsia="Consolas" w:hAnsi="Consolas"/>
-          <w:color w:val="1B2E1D"/>
-          <w:sz w:val="19"/>
-          <w:szCs w:val="19"/>
-        </w:rPr>
-        <w:t xml:space="preserve">  ➜  Network: http://192.168.0.7:5173/</w:t>
-      </w:r>
-    </w:p>
-    <w:p>
-      <w:pPr>
-        <w:pStyle w:val="ListParagraph"/>
-        <w:numPr>
-          <w:ilvl w:val="0"/>
-          <w:numId w:val="3"/>
-        </w:numPr>
-        <w:spacing w:after="60"/>
-      </w:pPr>
-      <w:r>
-        <w:t xml:space="preserve">On this PC: open </w:t>
-      </w:r>
-      <w:r>
-        <w:rPr>
-          <w:rFonts w:ascii="Consolas" w:cs="Consolas" w:eastAsia="Consolas" w:hAnsi="Consolas"/>
-          <w:color w:val="254229"/>
-          <w:sz w:val="20"/>
-          <w:szCs w:val="20"/>
-        </w:rPr>
-        <w:t xml:space="preserve">http://localhost:5173</w:t>
-      </w:r>
-      <w:r>
-        <w:t xml:space="preserve">.</w:t>
-      </w:r>
-    </w:p>
-    <w:p>
-      <w:pPr>
-        <w:pStyle w:val="ListParagraph"/>
-        <w:numPr>
-          <w:ilvl w:val="0"/>
-          <w:numId w:val="3"/>
-        </w:numPr>
-        <w:spacing w:after="60"/>
-      </w:pPr>
-      <w:r>
-        <w:t xml:space="preserve">On the tablet: open </w:t>
-      </w:r>
-      <w:r>
-        <w:rPr>
-          <w:rFonts w:ascii="Consolas" w:cs="Consolas" w:eastAsia="Consolas" w:hAnsi="Consolas"/>
-          <w:color w:val="254229"/>
-          <w:sz w:val="20"/>
-          <w:szCs w:val="20"/>
-        </w:rPr>
-        <w:t xml:space="preserve">http://192.168.0.7:5173</w:t>
-      </w:r>
-      <w:r>
-        <w:t xml:space="preserve"> (see section 5).</w:t>
-      </w:r>
-    </w:p>
-    <w:p>
-      <w:pPr>
-        <w:pStyle w:val="ListParagraph"/>
-        <w:numPr>
-          <w:ilvl w:val="0"/>
-          <w:numId w:val="3"/>
-        </w:numPr>
-        <w:spacing w:after="60"/>
-      </w:pPr>
-      <w:r>
-        <w:t xml:space="preserve">Stop the server with </w:t>
-      </w:r>
-      <w:r>
-        <w:rPr>
-          <w:rFonts w:ascii="Consolas" w:cs="Consolas" w:eastAsia="Consolas" w:hAnsi="Consolas"/>
-          <w:color w:val="254229"/>
-          <w:sz w:val="20"/>
-          <w:szCs w:val="20"/>
-        </w:rPr>
-        <w:t xml:space="preserve">Ctrl + C</w:t>
-      </w:r>
-      <w:r>
-        <w:t xml:space="preserve"> in that terminal.</w:t>
-      </w:r>
-    </w:p>
-    <w:p>
-      <w:pPr>
-        <w:pStyle w:val="Heading1"/>
-      </w:pPr>
-      <w:r>
-        <w:t xml:space="preserve">5. Open the UI on the tablet</w:t>
-      </w:r>
-    </w:p>
-    <w:p>
-      <w:pPr>
-        <w:spacing w:after="120"/>
-      </w:pPr>
-      <w:r>
-        <w:t xml:space="preserve">The servers listen on </w:t>
-      </w:r>
-      <w:r>
-        <w:rPr>
-          <w:b/>
-          <w:bCs/>
-        </w:rPr>
-        <w:t xml:space="preserve">0.0.0.0</w:t>
-      </w:r>
-      <w:r>
-        <w:t xml:space="preserve"> (every network interface), so any device on the same network can reach them by this PC's IP address and the port.</w:t>
-      </w:r>
-    </w:p>
-    <w:p>
-      <w:pPr>
-        <w:pStyle w:val="Heading2"/>
-      </w:pPr>
-      <w:r>
-        <w:t xml:space="preserve">5.1 Steps</w:t>
-      </w:r>
-    </w:p>
-    <w:p>
-      <w:pPr>
-        <w:pStyle w:val="ListParagraph"/>
-        <w:numPr>
-          <w:ilvl w:val="0"/>
-          <w:numId w:val="4"/>
-        </w:numPr>
-        <w:spacing w:after="60"/>
-      </w:pPr>
-      <w:r>
-        <w:t xml:space="preserve">Connect the tablet to the </w:t>
-      </w:r>
-      <w:r>
-        <w:rPr>
-          <w:b/>
-          <w:bCs/>
-        </w:rPr>
-        <w:t xml:space="preserve">same network</w:t>
-      </w:r>
-      <w:r>
-        <w:t xml:space="preserve"> as this PC (same Wi-Fi / LAN).</w:t>
-      </w:r>
-    </w:p>
-    <w:p>
-      <w:pPr>
-        <w:pStyle w:val="ListParagraph"/>
-        <w:numPr>
-          <w:ilvl w:val="0"/>
-          <w:numId w:val="4"/>
-        </w:numPr>
-        <w:spacing w:after="60"/>
-      </w:pPr>
-      <w:r>
-        <w:t xml:space="preserve">On this PC start either server: </w:t>
-      </w:r>
-      <w:r>
-        <w:rPr>
-          <w:rFonts w:ascii="Consolas" w:cs="Consolas" w:eastAsia="Consolas" w:hAnsi="Consolas"/>
-          <w:color w:val="254229"/>
-          <w:sz w:val="20"/>
-          <w:szCs w:val="20"/>
-        </w:rPr>
-        <w:t xml:space="preserve">npm run dev</w:t>
-      </w:r>
-      <w:r>
-        <w:t xml:space="preserve"> (port 5173) or </w:t>
-      </w:r>
-      <w:r>
-        <w:rPr>
-          <w:rFonts w:ascii="Consolas" w:cs="Consolas" w:eastAsia="Consolas" w:hAnsi="Consolas"/>
-          <w:color w:val="254229"/>
-          <w:sz w:val="20"/>
-          <w:szCs w:val="20"/>
-        </w:rPr>
-        <w:t xml:space="preserve">npm run build</w:t>
-      </w:r>
-      <w:r>
-        <w:t xml:space="preserve"> then </w:t>
-      </w:r>
-      <w:r>
-        <w:rPr>
-          <w:rFonts w:ascii="Consolas" w:cs="Consolas" w:eastAsia="Consolas" w:hAnsi="Consolas"/>
-          <w:color w:val="254229"/>
-          <w:sz w:val="20"/>
-          <w:szCs w:val="20"/>
-        </w:rPr>
-        <w:t xml:space="preserve">npm run preview</w:t>
-      </w:r>
-      <w:r>
-        <w:t xml:space="preserve"> (port 4173).</w:t>
-      </w:r>
-    </w:p>
-    <w:p>
-      <w:pPr>
-        <w:pStyle w:val="ListParagraph"/>
-        <w:numPr>
-          <w:ilvl w:val="0"/>
-          <w:numId w:val="4"/>
-        </w:numPr>
-        <w:spacing w:after="60"/>
-      </w:pPr>
-      <w:r>
-        <w:t xml:space="preserve">On the tablet's browser open </w:t>
-      </w:r>
-      <w:r>
-        <w:rPr>
-          <w:rFonts w:ascii="Consolas" w:cs="Consolas" w:eastAsia="Consolas" w:hAnsi="Consolas"/>
-          <w:color w:val="254229"/>
-          <w:sz w:val="20"/>
-          <w:szCs w:val="20"/>
-        </w:rPr>
-        <w:t xml:space="preserve">http://192.168.0.7:5173</w:t>
-      </w:r>
-      <w:r>
-        <w:t xml:space="preserve"> or </w:t>
-      </w:r>
-      <w:r>
-        <w:rPr>
-          <w:rFonts w:ascii="Consolas" w:cs="Consolas" w:eastAsia="Consolas" w:hAnsi="Consolas"/>
-          <w:color w:val="254229"/>
-          <w:sz w:val="20"/>
-          <w:szCs w:val="20"/>
-        </w:rPr>
-        <w:t xml:space="preserve">http://192.168.0.7:4173</w:t>
-      </w:r>
-      <w:r>
-        <w:t xml:space="preserve">.</w:t>
-      </w:r>
-    </w:p>
-    <w:p>
-      <w:pPr>
-        <w:pStyle w:val="ListParagraph"/>
-        <w:numPr>
-          <w:ilvl w:val="0"/>
-          <w:numId w:val="4"/>
-        </w:numPr>
-        <w:spacing w:after="60"/>
-      </w:pPr>
-      <w:r>
-        <w:t xml:space="preserve">The UI goes </w:t>
-      </w:r>
-      <w:r>
-        <w:rPr>
-          <w:b/>
-          <w:bCs/>
-        </w:rPr>
-        <w:t xml:space="preserve">full screen</w:t>
-      </w:r>
-      <w:r>
-        <w:t xml:space="preserve"> on the first tap. To leave it, tap the four-corner icon in the header (</w:t>
-      </w:r>
-      <w:r>
-        <w:rPr>
-          <w:b/>
-          <w:bCs/>
-        </w:rPr>
-        <w:t xml:space="preserve">Exit full screen</w:t>
-      </w:r>
-      <w:r>
-        <w:t xml:space="preserve">); tap it again for </w:t>
-      </w:r>
-      <w:r>
-        <w:rPr>
-          <w:b/>
-          <w:bCs/>
-        </w:rPr>
-        <w:t xml:space="preserve">Full screen</w:t>
-      </w:r>
-      <w:r>
-        <w:t xml:space="preserve">. The tablet remembers the choice.</w:t>
-      </w:r>
-    </w:p>
-    <w:p>
-      <w:pPr>
-        <w:pStyle w:val="Heading2"/>
-      </w:pPr>
-      <w:r>
-        <w:t xml:space="preserve">5.2 Full screen and the keyboard</w:t>
-      </w:r>
-    </w:p>
-    <w:p>
-      <w:pPr>
-        <w:spacing w:after="120"/>
-      </w:pPr>
-      <w:r>
-        <w:t xml:space="preserve">Browsers only allow a web page to go full screen after a tap, so the app cannot start full screen by itself; it switches on the first tap. Many Android browsers leave full screen when the on-screen keyboard opens. This cannot be blocked by a web page, so the app restores full screen on the next tap outside a text field (for example Sign In or Start Session).</w:t>
-      </w:r>
-    </w:p>
-    <w:p>
-      <w:pPr>
-        <w:spacing w:after="120"/>
-      </w:pPr>
-      <w:r>
-        <w:t xml:space="preserve">For a permanent full screen with no browser bar at all, add the app to the home screen and open it from there (it launches as a full-screen app):</w:t>
-      </w:r>
-    </w:p>
-    <w:p>
-      <w:pPr>
-        <w:pStyle w:val="ListParagraph"/>
-        <w:numPr>
-          <w:ilvl w:val="0"/>
-          <w:numId w:val="5"/>
-        </w:numPr>
-        <w:spacing w:after="60"/>
-      </w:pPr>
-      <w:r>
-        <w:t xml:space="preserve">In Chrome on the tablet, open the UI address, tap the ⋮ menu and choose </w:t>
-      </w:r>
-      <w:r>
-        <w:rPr>
-          <w:b/>
-          <w:bCs/>
-        </w:rPr>
-        <w:t xml:space="preserve">Add to Home screen</w:t>
-      </w:r>
-      <w:r>
-        <w:t xml:space="preserve"> or </w:t>
-      </w:r>
-      <w:r>
-        <w:rPr>
-          <w:b/>
-          <w:bCs/>
-        </w:rPr>
-        <w:t xml:space="preserve">Install app</w:t>
-      </w:r>
-      <w:r>
-        <w:t xml:space="preserve">.</w:t>
-      </w:r>
-    </w:p>
-    <w:p>
-      <w:pPr>
-        <w:pStyle w:val="ListParagraph"/>
-        <w:numPr>
-          <w:ilvl w:val="0"/>
-          <w:numId w:val="5"/>
-        </w:numPr>
-        <w:spacing w:after="60"/>
-      </w:pPr>
-      <w:r>
-        <w:t xml:space="preserve">Chrome only installs full-screen apps from secure (https) addresses. For the local </w:t>
-      </w:r>
-      <w:r>
-        <w:rPr>
-          <w:rFonts w:ascii="Consolas" w:cs="Consolas" w:eastAsia="Consolas" w:hAnsi="Consolas"/>
-          <w:color w:val="254229"/>
-          <w:sz w:val="20"/>
-          <w:szCs w:val="20"/>
-        </w:rPr>
-        <w:t xml:space="preserve">http://</w:t>
-      </w:r>
-      <w:r>
-        <w:t xml:space="preserve"> address, first open </w:t>
-      </w:r>
-      <w:r>
-        <w:rPr>
-          <w:rFonts w:ascii="Consolas" w:cs="Consolas" w:eastAsia="Consolas" w:hAnsi="Consolas"/>
-          <w:color w:val="254229"/>
-          <w:sz w:val="20"/>
-          <w:szCs w:val="20"/>
-        </w:rPr>
-        <w:t xml:space="preserve">chrome://flags/#unsafely-treat-insecure-origin-as-secure</w:t>
-      </w:r>
-      <w:r>
-        <w:t xml:space="preserve"> on the tablet, enter the UI address (e.g. </w:t>
-      </w:r>
-      <w:r>
-        <w:rPr>
-          <w:rFonts w:ascii="Consolas" w:cs="Consolas" w:eastAsia="Consolas" w:hAnsi="Consolas"/>
-          <w:color w:val="254229"/>
-          <w:sz w:val="20"/>
-          <w:szCs w:val="20"/>
-        </w:rPr>
-        <w:t xml:space="preserve">http://192.168.0.7:4173</w:t>
-      </w:r>
-      <w:r>
-        <w:t xml:space="preserve">), set it to </w:t>
-      </w:r>
-      <w:r>
-        <w:rPr>
-          <w:b/>
-          <w:bCs/>
-        </w:rPr>
-        <w:t xml:space="preserve">Enabled</w:t>
-      </w:r>
-      <w:r>
-        <w:t xml:space="preserve"> and restart Chrome.</w:t>
-      </w:r>
-    </w:p>
-    <w:p>
-      <w:pPr>
-        <w:pStyle w:val="ListParagraph"/>
-        <w:numPr>
-          <w:ilvl w:val="0"/>
-          <w:numId w:val="5"/>
-        </w:numPr>
-        <w:spacing w:after="60"/>
-      </w:pPr>
-      <w:r>
-        <w:t xml:space="preserve">Open CARE 2.0 from the home-screen icon. The full-screen button is hidden there because the app is always full screen.</w:t>
-      </w:r>
-    </w:p>
-    <w:p>
-      <w:pPr>
-        <w:pBdr>
-          <w:left w:val="single" w:color="ED6C2A" w:sz="24" w:space="8"/>
-        </w:pBdr>
-        <w:shd w:fill="FDF1E8" w:color="auto" w:val="clear"/>
-        <w:spacing w:after="160" w:before="80" w:line="276"/>
-        <w:ind w:left="160" w:right="160"/>
-      </w:pPr>
-      <w:r>
-        <w:rPr>
-          <w:b/>
-          <w:bCs/>
-          <w:color w:val="B4531A"/>
-        </w:rPr>
-        <w:t xml:space="preserve">Important: </w:t>
-      </w:r>
-      <w:r>
-        <w:t xml:space="preserve">The Chrome flag is a setting on the tablet; change it yourself only if you want the installed full-screen app.</w:t>
-      </w:r>
-    </w:p>
-    <w:p>
-      <w:pPr>
-        <w:pStyle w:val="Heading2"/>
-      </w:pPr>
-      <w:r>
-        <w:t xml:space="preserve">5.3 Find this PC's IP address</w:t>
-      </w:r>
-    </w:p>
-    <w:p>
-      <w:pPr>
-        <w:spacing w:after="120"/>
-      </w:pPr>
-      <w:r>
-        <w:t xml:space="preserve">The address can change (for example after a router restart). Check the current one with:</w:t>
+        <w:t xml:space="preserve">Then start the UI. It is a live-reloading server: saving a source file updates the page instantly.</w:t>
       </w:r>
     </w:p>
     <w:p>
@@ -2713,7 +2590,7 @@
           <w:sz w:val="17"/>
           <w:szCs w:val="17"/>
         </w:rPr>
-        <w:t xml:space="preserve">PowerShell or Command Prompt</w:t>
+        <w:t xml:space="preserve">Terminal 2</w:t>
       </w:r>
     </w:p>
     <w:p>
@@ -2737,7 +2614,7 @@
           <w:sz w:val="19"/>
           <w:szCs w:val="19"/>
         </w:rPr>
-        <w:t xml:space="preserve">ipconfig</w:t>
+        <w:t xml:space="preserve">npm run dev</w:t>
       </w:r>
     </w:p>
     <w:p>
@@ -2745,49 +2622,75 @@
         <w:spacing w:after="120"/>
       </w:pPr>
       <w:r>
-        <w:t xml:space="preserve">Use the </w:t>
-      </w:r>
-      <w:r>
-        <w:rPr>
-          <w:b/>
-          <w:bCs/>
-        </w:rPr>
-        <w:t xml:space="preserve">IPv4 Address</w:t>
-      </w:r>
-      <w:r>
-        <w:t xml:space="preserve"> of the adapter connected to the network the tablet uses (currently </w:t>
-      </w:r>
-      <w:r>
-        <w:rPr>
-          <w:rFonts w:ascii="Consolas" w:cs="Consolas" w:eastAsia="Consolas" w:hAnsi="Consolas"/>
-          <w:color w:val="254229"/>
-          <w:sz w:val="20"/>
-          <w:szCs w:val="20"/>
-        </w:rPr>
-        <w:t xml:space="preserve">192.168.0.7</w:t>
-      </w:r>
-      <w:r>
-        <w:t xml:space="preserve"> on "Ethernet"). Ignore </w:t>
-      </w:r>
-      <w:r>
-        <w:rPr>
-          <w:rFonts w:ascii="Consolas" w:cs="Consolas" w:eastAsia="Consolas" w:hAnsi="Consolas"/>
-          <w:color w:val="254229"/>
-          <w:sz w:val="20"/>
-          <w:szCs w:val="20"/>
-        </w:rPr>
-        <w:t xml:space="preserve">192.168.56.1</w:t>
-      </w:r>
-      <w:r>
-        <w:t xml:space="preserve">, which is a VirtualBox-only adapter.</w:t>
-      </w:r>
-    </w:p>
-    <w:p>
-      <w:pPr>
-        <w:pStyle w:val="Heading2"/>
-      </w:pPr>
-      <w:r>
-        <w:t xml:space="preserve">5.4 If the tablet cannot connect</w:t>
+        <w:t xml:space="preserve">Vite prints the addresses it is listening on, for example:</w:t>
+      </w:r>
+    </w:p>
+    <w:p>
+      <w:pPr>
+        <w:keepNext/>
+        <w:keepLines/>
+        <w:pBdr>
+          <w:top w:val="single" w:color="C9D8C3" w:sz="6" w:space="4"/>
+          <w:left w:val="single" w:color="639850" w:sz="18" w:space="6"/>
+          <w:right w:val="single" w:color="C9D8C3" w:sz="6" w:space="4"/>
+        </w:pBdr>
+        <w:shd w:fill="F3F6F1" w:color="auto" w:val="clear"/>
+        <w:spacing w:after="0" w:before="40" w:line="276"/>
+        <w:ind w:left="120" w:right="120"/>
+      </w:pPr>
+      <w:r>
+        <w:rPr>
+          <w:rFonts w:ascii="Consolas" w:cs="Consolas" w:eastAsia="Consolas" w:hAnsi="Consolas"/>
+          <w:color w:val="1B2E1D"/>
+          <w:sz w:val="19"/>
+          <w:szCs w:val="19"/>
+        </w:rPr>
+        <w:t xml:space="preserve">  VITE ready</w:t>
+      </w:r>
+    </w:p>
+    <w:p>
+      <w:pPr>
+        <w:keepNext/>
+        <w:keepLines/>
+        <w:pBdr>
+          <w:left w:val="single" w:color="639850" w:sz="18" w:space="6"/>
+          <w:right w:val="single" w:color="C9D8C3" w:sz="6" w:space="4"/>
+        </w:pBdr>
+        <w:shd w:fill="F3F6F1" w:color="auto" w:val="clear"/>
+        <w:spacing w:after="0" w:before="0" w:line="276"/>
+        <w:ind w:left="120" w:right="120"/>
+      </w:pPr>
+      <w:r>
+        <w:rPr>
+          <w:rFonts w:ascii="Consolas" w:cs="Consolas" w:eastAsia="Consolas" w:hAnsi="Consolas"/>
+          <w:color w:val="1B2E1D"/>
+          <w:sz w:val="19"/>
+          <w:szCs w:val="19"/>
+        </w:rPr>
+        <w:t xml:space="preserve">  ➜  Local:   http://localhost:5173/</w:t>
+      </w:r>
+    </w:p>
+    <w:p>
+      <w:pPr>
+        <w:keepNext w:val="false"/>
+        <w:keepLines/>
+        <w:pBdr>
+          <w:bottom w:val="single" w:color="C9D8C3" w:sz="6" w:space="4"/>
+          <w:left w:val="single" w:color="639850" w:sz="18" w:space="6"/>
+          <w:right w:val="single" w:color="C9D8C3" w:sz="6" w:space="4"/>
+        </w:pBdr>
+        <w:shd w:fill="F3F6F1" w:color="auto" w:val="clear"/>
+        <w:spacing w:after="160" w:before="0" w:line="276"/>
+        <w:ind w:left="120" w:right="120"/>
+      </w:pPr>
+      <w:r>
+        <w:rPr>
+          <w:rFonts w:ascii="Consolas" w:cs="Consolas" w:eastAsia="Consolas" w:hAnsi="Consolas"/>
+          <w:color w:val="1B2E1D"/>
+          <w:sz w:val="19"/>
+          <w:szCs w:val="19"/>
+        </w:rPr>
+        <w:t xml:space="preserve">  ➜  Network: http://192.168.0.7:5173/</w:t>
       </w:r>
     </w:p>
     <w:p>
@@ -2800,7 +2703,7 @@
         <w:spacing w:after="60"/>
       </w:pPr>
       <w:r>
-        <w:t xml:space="preserve">Check the tablet and PC are on the same network, and that the URL starts with </w:t>
+        <w:t xml:space="preserve">On this PC: open </w:t>
       </w:r>
       <w:r>
         <w:rPr>
@@ -2809,10 +2712,10 @@
           <w:sz w:val="20"/>
           <w:szCs w:val="20"/>
         </w:rPr>
-        <w:t xml:space="preserve">http://</w:t>
-      </w:r>
-      <w:r>
-        <w:t xml:space="preserve"> (not https) and includes the port.</w:t>
+        <w:t xml:space="preserve">http://localhost:5173</w:t>
+      </w:r>
+      <w:r>
+        <w:t xml:space="preserve">.</w:t>
       </w:r>
     </w:p>
     <w:p>
@@ -2825,7 +2728,7 @@
         <w:spacing w:after="60"/>
       </w:pPr>
       <w:r>
-        <w:t xml:space="preserve">From this PC, open </w:t>
+        <w:t xml:space="preserve">On the tablet: open </w:t>
       </w:r>
       <w:r>
         <w:rPr>
@@ -2837,7 +2740,7 @@
         <w:t xml:space="preserve">http://192.168.0.7:5173</w:t>
       </w:r>
       <w:r>
-        <w:t xml:space="preserve">. If it works here but not on the tablet, the Windows Firewall is blocking it.</w:t>
+        <w:t xml:space="preserve"> (see section 5).</w:t>
       </w:r>
     </w:p>
     <w:p>
@@ -2850,27 +2753,538 @@
         <w:spacing w:after="60"/>
       </w:pPr>
       <w:r>
-        <w:t xml:space="preserve">This PC's network is a </w:t>
+        <w:t xml:space="preserve">Stop the server with </w:t>
+      </w:r>
+      <w:r>
+        <w:rPr>
+          <w:rFonts w:ascii="Consolas" w:cs="Consolas" w:eastAsia="Consolas" w:hAnsi="Consolas"/>
+          <w:color w:val="254229"/>
+          <w:sz w:val="20"/>
+          <w:szCs w:val="20"/>
+        </w:rPr>
+        <w:t xml:space="preserve">Ctrl + C</w:t>
+      </w:r>
+      <w:r>
+        <w:t xml:space="preserve"> in that terminal.</w:t>
+      </w:r>
+    </w:p>
+    <w:p>
+      <w:pPr>
+        <w:pStyle w:val="Heading1"/>
+      </w:pPr>
+      <w:r>
+        <w:t xml:space="preserve">5. Open the UI on the tablet</w:t>
+      </w:r>
+    </w:p>
+    <w:p>
+      <w:pPr>
+        <w:spacing w:after="120"/>
+      </w:pPr>
+      <w:r>
+        <w:t xml:space="preserve">The servers listen on </w:t>
       </w:r>
       <w:r>
         <w:rPr>
           <w:b/>
           <w:bCs/>
         </w:rPr>
-        <w:t xml:space="preserve">Domain</w:t>
-      </w:r>
-      <w:r>
-        <w:t xml:space="preserve"> network, where Node.js is already allowed. If the network profile changes to Private or Public, allow the ports once from an </w:t>
+        <w:t xml:space="preserve">0.0.0.0</w:t>
+      </w:r>
+      <w:r>
+        <w:t xml:space="preserve"> (every network interface), so any device on the same network can reach them by this PC's IP address and the port.</w:t>
+      </w:r>
+    </w:p>
+    <w:p>
+      <w:pPr>
+        <w:pStyle w:val="Heading2"/>
+      </w:pPr>
+      <w:r>
+        <w:t xml:space="preserve">5.1 Steps</w:t>
+      </w:r>
+    </w:p>
+    <w:p>
+      <w:pPr>
+        <w:pStyle w:val="ListParagraph"/>
+        <w:numPr>
+          <w:ilvl w:val="0"/>
+          <w:numId w:val="4"/>
+        </w:numPr>
+        <w:spacing w:after="60"/>
+      </w:pPr>
+      <w:r>
+        <w:t xml:space="preserve">Connect the tablet to the </w:t>
       </w:r>
       <w:r>
         <w:rPr>
           <w:b/>
           <w:bCs/>
         </w:rPr>
-        <w:t xml:space="preserve">Administrator</w:t>
-      </w:r>
-      <w:r>
-        <w:t xml:space="preserve"> PowerShell:</w:t>
+        <w:t xml:space="preserve">same network</w:t>
+      </w:r>
+      <w:r>
+        <w:t xml:space="preserve"> as this PC (same Wi-Fi / LAN).</w:t>
+      </w:r>
+    </w:p>
+    <w:p>
+      <w:pPr>
+        <w:pStyle w:val="ListParagraph"/>
+        <w:numPr>
+          <w:ilvl w:val="0"/>
+          <w:numId w:val="4"/>
+        </w:numPr>
+        <w:spacing w:after="60"/>
+      </w:pPr>
+      <w:r>
+        <w:t xml:space="preserve">On this PC start either server: </w:t>
+      </w:r>
+      <w:r>
+        <w:rPr>
+          <w:rFonts w:ascii="Consolas" w:cs="Consolas" w:eastAsia="Consolas" w:hAnsi="Consolas"/>
+          <w:color w:val="254229"/>
+          <w:sz w:val="20"/>
+          <w:szCs w:val="20"/>
+        </w:rPr>
+        <w:t xml:space="preserve">npm run dev</w:t>
+      </w:r>
+      <w:r>
+        <w:t xml:space="preserve"> (port 5173) or </w:t>
+      </w:r>
+      <w:r>
+        <w:rPr>
+          <w:rFonts w:ascii="Consolas" w:cs="Consolas" w:eastAsia="Consolas" w:hAnsi="Consolas"/>
+          <w:color w:val="254229"/>
+          <w:sz w:val="20"/>
+          <w:szCs w:val="20"/>
+        </w:rPr>
+        <w:t xml:space="preserve">npm run build</w:t>
+      </w:r>
+      <w:r>
+        <w:t xml:space="preserve"> then </w:t>
+      </w:r>
+      <w:r>
+        <w:rPr>
+          <w:rFonts w:ascii="Consolas" w:cs="Consolas" w:eastAsia="Consolas" w:hAnsi="Consolas"/>
+          <w:color w:val="254229"/>
+          <w:sz w:val="20"/>
+          <w:szCs w:val="20"/>
+        </w:rPr>
+        <w:t xml:space="preserve">npm run preview</w:t>
+      </w:r>
+      <w:r>
+        <w:t xml:space="preserve"> (port 4173).</w:t>
+      </w:r>
+    </w:p>
+    <w:p>
+      <w:pPr>
+        <w:pStyle w:val="ListParagraph"/>
+        <w:numPr>
+          <w:ilvl w:val="0"/>
+          <w:numId w:val="4"/>
+        </w:numPr>
+        <w:spacing w:after="60"/>
+      </w:pPr>
+      <w:r>
+        <w:t xml:space="preserve">On the tablet's browser open </w:t>
+      </w:r>
+      <w:r>
+        <w:rPr>
+          <w:rFonts w:ascii="Consolas" w:cs="Consolas" w:eastAsia="Consolas" w:hAnsi="Consolas"/>
+          <w:color w:val="254229"/>
+          <w:sz w:val="20"/>
+          <w:szCs w:val="20"/>
+        </w:rPr>
+        <w:t xml:space="preserve">http://192.168.0.7:5173</w:t>
+      </w:r>
+      <w:r>
+        <w:t xml:space="preserve"> or </w:t>
+      </w:r>
+      <w:r>
+        <w:rPr>
+          <w:rFonts w:ascii="Consolas" w:cs="Consolas" w:eastAsia="Consolas" w:hAnsi="Consolas"/>
+          <w:color w:val="254229"/>
+          <w:sz w:val="20"/>
+          <w:szCs w:val="20"/>
+        </w:rPr>
+        <w:t xml:space="preserve">http://192.168.0.7:4173</w:t>
+      </w:r>
+      <w:r>
+        <w:t xml:space="preserve">.</w:t>
+      </w:r>
+    </w:p>
+    <w:p>
+      <w:pPr>
+        <w:pStyle w:val="ListParagraph"/>
+        <w:numPr>
+          <w:ilvl w:val="0"/>
+          <w:numId w:val="4"/>
+        </w:numPr>
+        <w:spacing w:after="60"/>
+      </w:pPr>
+      <w:r>
+        <w:t xml:space="preserve">The UI goes </w:t>
+      </w:r>
+      <w:r>
+        <w:rPr>
+          <w:b/>
+          <w:bCs/>
+        </w:rPr>
+        <w:t xml:space="preserve">full screen</w:t>
+      </w:r>
+      <w:r>
+        <w:t xml:space="preserve"> on the first tap. To leave it, tap the four-corner icon in the header (</w:t>
+      </w:r>
+      <w:r>
+        <w:rPr>
+          <w:b/>
+          <w:bCs/>
+        </w:rPr>
+        <w:t xml:space="preserve">Exit full screen</w:t>
+      </w:r>
+      <w:r>
+        <w:t xml:space="preserve">); tap it again for </w:t>
+      </w:r>
+      <w:r>
+        <w:rPr>
+          <w:b/>
+          <w:bCs/>
+        </w:rPr>
+        <w:t xml:space="preserve">Full screen</w:t>
+      </w:r>
+      <w:r>
+        <w:t xml:space="preserve">. The tablet remembers the choice.</w:t>
+      </w:r>
+    </w:p>
+    <w:p>
+      <w:pPr>
+        <w:pStyle w:val="Heading2"/>
+      </w:pPr>
+      <w:r>
+        <w:t xml:space="preserve">5.2 Full screen and the keyboard</w:t>
+      </w:r>
+    </w:p>
+    <w:p>
+      <w:pPr>
+        <w:spacing w:after="120"/>
+      </w:pPr>
+      <w:r>
+        <w:t xml:space="preserve">The app runs in </w:t>
+      </w:r>
+      <w:r>
+        <w:rPr>
+          <w:b/>
+          <w:bCs/>
+        </w:rPr>
+        <w:t xml:space="preserve">kiosk mode</w:t>
+      </w:r>
+      <w:r>
+        <w:t xml:space="preserve"> (</w:t>
+      </w:r>
+      <w:r>
+        <w:rPr>
+          <w:rFonts w:ascii="Consolas" w:cs="Consolas" w:eastAsia="Consolas" w:hAnsi="Consolas"/>
+          <w:color w:val="254229"/>
+          <w:sz w:val="20"/>
+          <w:szCs w:val="20"/>
+        </w:rPr>
+        <w:t xml:space="preserve">kiosk: true</w:t>
+      </w:r>
+      <w:r>
+        <w:t xml:space="preserve"> in </w:t>
+      </w:r>
+      <w:r>
+        <w:rPr>
+          <w:rFonts w:ascii="Consolas" w:cs="Consolas" w:eastAsia="Consolas" w:hAnsi="Consolas"/>
+          <w:color w:val="254229"/>
+          <w:sz w:val="20"/>
+          <w:szCs w:val="20"/>
+        </w:rPr>
+        <w:t xml:space="preserve">config.js</w:t>
+      </w:r>
+      <w:r>
+        <w:t xml:space="preserve">). Browsers only allow full screen after a tap, so until the app is full screen a </w:t>
+      </w:r>
+      <w:r>
+        <w:rPr>
+          <w:b/>
+          <w:bCs/>
+        </w:rPr>
+        <w:t xml:space="preserve">Tap anywhere to continue</w:t>
+      </w:r>
+      <w:r>
+        <w:t xml:space="preserve"> screen covers it, and that tap enters full screen. There is no Exit full screen option.</w:t>
+      </w:r>
+    </w:p>
+    <w:p>
+      <w:pPr>
+        <w:spacing w:after="120"/>
+      </w:pPr>
+      <w:r>
+        <w:t xml:space="preserve">Tablet browsers leave full screen whenever their own keyboard opens, so the tablet keyboard is not used. Tapping a text field opens the </w:t>
+      </w:r>
+      <w:r>
+        <w:rPr>
+          <w:b/>
+          <w:bCs/>
+        </w:rPr>
+        <w:t xml:space="preserve">keyboard built into the UI</w:t>
+      </w:r>
+      <w:r>
+        <w:t xml:space="preserve">: letters, a 123 key for numbers and symbols, and a number pad for numeric fields such as weight and heart rate. </w:t>
+      </w:r>
+      <w:r>
+        <w:rPr>
+          <w:b/>
+          <w:bCs/>
+        </w:rPr>
+        <w:t xml:space="preserve">Enter</w:t>
+      </w:r>
+      <w:r>
+        <w:t xml:space="preserve"> submits (for example Sign In), </w:t>
+      </w:r>
+      <w:r>
+        <w:rPr>
+          <w:b/>
+          <w:bCs/>
+        </w:rPr>
+        <w:t xml:space="preserve">Done</w:t>
+      </w:r>
+      <w:r>
+        <w:t xml:space="preserve"> closes it, and the screen slides up so the field stays visible. A hardware keyboard also works. To use the tablet keyboard instead, set </w:t>
+      </w:r>
+      <w:r>
+        <w:rPr>
+          <w:rFonts w:ascii="Consolas" w:cs="Consolas" w:eastAsia="Consolas" w:hAnsi="Consolas"/>
+          <w:color w:val="254229"/>
+          <w:sz w:val="20"/>
+          <w:szCs w:val="20"/>
+        </w:rPr>
+        <w:t xml:space="preserve">onScreenKeyboard: false</w:t>
+      </w:r>
+      <w:r>
+        <w:t xml:space="preserve"> in </w:t>
+      </w:r>
+      <w:r>
+        <w:rPr>
+          <w:rFonts w:ascii="Consolas" w:cs="Consolas" w:eastAsia="Consolas" w:hAnsi="Consolas"/>
+          <w:color w:val="254229"/>
+          <w:sz w:val="20"/>
+          <w:szCs w:val="20"/>
+        </w:rPr>
+        <w:t xml:space="preserve">config.js</w:t>
+      </w:r>
+      <w:r>
+        <w:t xml:space="preserve"> (full screen will then drop while typing).</w:t>
+      </w:r>
+    </w:p>
+    <w:p>
+      <w:pPr>
+        <w:spacing w:after="120"/>
+      </w:pPr>
+      <w:r>
+        <w:t xml:space="preserve">The cover never appears on the Session screen, so the Emergency stop is always one tap away.</w:t>
+      </w:r>
+    </w:p>
+    <w:p>
+      <w:pPr>
+        <w:spacing w:after="120"/>
+      </w:pPr>
+      <w:r>
+        <w:t xml:space="preserve">Kiosk mode also blocks right-click and long-press menus, F12 and the other developer-tool keys, view source, reload, zoom and leaving through the Back button. Set </w:t>
+      </w:r>
+      <w:r>
+        <w:rPr>
+          <w:rFonts w:ascii="Consolas" w:cs="Consolas" w:eastAsia="Consolas" w:hAnsi="Consolas"/>
+          <w:color w:val="254229"/>
+          <w:sz w:val="20"/>
+          <w:szCs w:val="20"/>
+        </w:rPr>
+        <w:t xml:space="preserve">kiosk: false</w:t>
+      </w:r>
+      <w:r>
+        <w:t xml:space="preserve"> in </w:t>
+      </w:r>
+      <w:r>
+        <w:rPr>
+          <w:rFonts w:ascii="Consolas" w:cs="Consolas" w:eastAsia="Consolas" w:hAnsi="Consolas"/>
+          <w:color w:val="254229"/>
+          <w:sz w:val="20"/>
+          <w:szCs w:val="20"/>
+        </w:rPr>
+        <w:t xml:space="preserve">config.js</w:t>
+      </w:r>
+      <w:r>
+        <w:t xml:space="preserve"> while developing.</w:t>
+      </w:r>
+    </w:p>
+    <w:p>
+      <w:pPr>
+        <w:pBdr>
+          <w:left w:val="single" w:color="639850" w:sz="24" w:space="8"/>
+        </w:pBdr>
+        <w:shd w:fill="EAF3E6" w:color="auto" w:val="clear"/>
+        <w:spacing w:after="160" w:before="80" w:line="276"/>
+        <w:ind w:left="160" w:right="160"/>
+      </w:pPr>
+      <w:r>
+        <w:rPr>
+          <w:b/>
+          <w:bCs/>
+          <w:color w:val="254229"/>
+        </w:rPr>
+        <w:t xml:space="preserve">Note: </w:t>
+      </w:r>
+      <w:r>
+        <w:t xml:space="preserve">A web page cannot hide the address bar or stop someone from leaving full screen with Esc or a swipe. For a locked tablet, install the app to the home screen (below) and turn on the tablet’s screen pinning / kiosk mode.</w:t>
+      </w:r>
+    </w:p>
+    <w:p>
+      <w:pPr>
+        <w:spacing w:after="120"/>
+      </w:pPr>
+      <w:r>
+        <w:t xml:space="preserve">For a permanent full screen with no browser bar at all, add the app to the home screen and open it from there (it launches as a full-screen app):</w:t>
+      </w:r>
+    </w:p>
+    <w:p>
+      <w:pPr>
+        <w:pStyle w:val="ListParagraph"/>
+        <w:numPr>
+          <w:ilvl w:val="0"/>
+          <w:numId w:val="5"/>
+        </w:numPr>
+        <w:spacing w:after="60"/>
+      </w:pPr>
+      <w:r>
+        <w:t xml:space="preserve">In Chrome on the tablet, open the UI address, tap the ⋮ menu and choose </w:t>
+      </w:r>
+      <w:r>
+        <w:rPr>
+          <w:b/>
+          <w:bCs/>
+        </w:rPr>
+        <w:t xml:space="preserve">Add to Home screen</w:t>
+      </w:r>
+      <w:r>
+        <w:t xml:space="preserve"> or </w:t>
+      </w:r>
+      <w:r>
+        <w:rPr>
+          <w:b/>
+          <w:bCs/>
+        </w:rPr>
+        <w:t xml:space="preserve">Install app</w:t>
+      </w:r>
+      <w:r>
+        <w:t xml:space="preserve">.</w:t>
+      </w:r>
+    </w:p>
+    <w:p>
+      <w:pPr>
+        <w:pStyle w:val="ListParagraph"/>
+        <w:numPr>
+          <w:ilvl w:val="0"/>
+          <w:numId w:val="5"/>
+        </w:numPr>
+        <w:spacing w:after="60"/>
+      </w:pPr>
+      <w:r>
+        <w:t xml:space="preserve">Chrome only installs full-screen apps from secure (https) addresses. For the local </w:t>
+      </w:r>
+      <w:r>
+        <w:rPr>
+          <w:rFonts w:ascii="Consolas" w:cs="Consolas" w:eastAsia="Consolas" w:hAnsi="Consolas"/>
+          <w:color w:val="254229"/>
+          <w:sz w:val="20"/>
+          <w:szCs w:val="20"/>
+        </w:rPr>
+        <w:t xml:space="preserve">http://</w:t>
+      </w:r>
+      <w:r>
+        <w:t xml:space="preserve"> address, first open </w:t>
+      </w:r>
+      <w:r>
+        <w:rPr>
+          <w:rFonts w:ascii="Consolas" w:cs="Consolas" w:eastAsia="Consolas" w:hAnsi="Consolas"/>
+          <w:color w:val="254229"/>
+          <w:sz w:val="20"/>
+          <w:szCs w:val="20"/>
+        </w:rPr>
+        <w:t xml:space="preserve">chrome://flags/#unsafely-treat-insecure-origin-as-secure</w:t>
+      </w:r>
+      <w:r>
+        <w:t xml:space="preserve"> on the tablet, enter the UI address (e.g. </w:t>
+      </w:r>
+      <w:r>
+        <w:rPr>
+          <w:rFonts w:ascii="Consolas" w:cs="Consolas" w:eastAsia="Consolas" w:hAnsi="Consolas"/>
+          <w:color w:val="254229"/>
+          <w:sz w:val="20"/>
+          <w:szCs w:val="20"/>
+        </w:rPr>
+        <w:t xml:space="preserve">http://192.168.0.7:4173</w:t>
+      </w:r>
+      <w:r>
+        <w:t xml:space="preserve">), set it to </w:t>
+      </w:r>
+      <w:r>
+        <w:rPr>
+          <w:b/>
+          <w:bCs/>
+        </w:rPr>
+        <w:t xml:space="preserve">Enabled</w:t>
+      </w:r>
+      <w:r>
+        <w:t xml:space="preserve"> and restart Chrome.</w:t>
+      </w:r>
+    </w:p>
+    <w:p>
+      <w:pPr>
+        <w:pStyle w:val="ListParagraph"/>
+        <w:numPr>
+          <w:ilvl w:val="0"/>
+          <w:numId w:val="5"/>
+        </w:numPr>
+        <w:spacing w:after="60"/>
+      </w:pPr>
+      <w:r>
+        <w:t xml:space="preserve">Open CARE 2.0 from the home-screen icon. The full-screen button is hidden there because the app is always full screen.</w:t>
+      </w:r>
+    </w:p>
+    <w:p>
+      <w:pPr>
+        <w:pBdr>
+          <w:left w:val="single" w:color="ED6C2A" w:sz="24" w:space="8"/>
+        </w:pBdr>
+        <w:shd w:fill="FDF1E8" w:color="auto" w:val="clear"/>
+        <w:spacing w:after="160" w:before="80" w:line="276"/>
+        <w:ind w:left="160" w:right="160"/>
+      </w:pPr>
+      <w:r>
+        <w:rPr>
+          <w:b/>
+          <w:bCs/>
+          <w:color w:val="B4531A"/>
+        </w:rPr>
+        <w:t xml:space="preserve">Important: </w:t>
+      </w:r>
+      <w:r>
+        <w:t xml:space="preserve">The Chrome flag is a setting on the tablet; change it yourself only if you want the installed full-screen app.</w:t>
+      </w:r>
+    </w:p>
+    <w:p>
+      <w:pPr>
+        <w:pStyle w:val="Heading2"/>
+      </w:pPr>
+      <w:r>
+        <w:t xml:space="preserve">5.3 Find this PC's IP address</w:t>
+      </w:r>
+    </w:p>
+    <w:p>
+      <w:pPr>
+        <w:spacing w:after="120"/>
+      </w:pPr>
+      <w:r>
+        <w:t xml:space="preserve">The address can change (for example after a router restart). Check the current one with:</w:t>
       </w:r>
     </w:p>
     <w:p>
@@ -2886,7 +3300,7 @@
           <w:sz w:val="17"/>
           <w:szCs w:val="17"/>
         </w:rPr>
-        <w:t xml:space="preserve">Administrator PowerShell (one time)</w:t>
+        <w:t xml:space="preserve">PowerShell or Command Prompt</w:t>
       </w:r>
     </w:p>
     <w:p>
@@ -2910,44 +3324,25 @@
           <w:sz w:val="19"/>
           <w:szCs w:val="19"/>
         </w:rPr>
-        <w:t xml:space="preserve">New-NetFirewallRule -DisplayName "CARE UI (5173, 4173)" -Direction Inbound -Protocol TCP -LocalPort 5173,4173 -Action Allow</w:t>
-      </w:r>
-    </w:p>
-    <w:p>
-      <w:pPr>
-        <w:pBdr>
-          <w:left w:val="single" w:color="ED6C2A" w:sz="24" w:space="8"/>
-        </w:pBdr>
-        <w:shd w:fill="FDF1E8" w:color="auto" w:val="clear"/>
-        <w:spacing w:after="160" w:before="80" w:line="276"/>
-        <w:ind w:left="160" w:right="160"/>
-      </w:pPr>
+        <w:t xml:space="preserve">ipconfig</w:t>
+      </w:r>
+    </w:p>
+    <w:p>
+      <w:pPr>
+        <w:spacing w:after="120"/>
+      </w:pPr>
+      <w:r>
+        <w:t xml:space="preserve">Use the </w:t>
+      </w:r>
       <w:r>
         <w:rPr>
           <w:b/>
           <w:bCs/>
-          <w:color w:val="B4531A"/>
-        </w:rPr>
-        <w:t xml:space="preserve">Important: </w:t>
-      </w:r>
-      <w:r>
-        <w:t xml:space="preserve">That command changes the firewall configuration of this PC. Run it yourself only if the tablet cannot connect.</w:t>
-      </w:r>
-    </w:p>
-    <w:p>
-      <w:pPr>
-        <w:pStyle w:val="Heading1"/>
-      </w:pPr>
-      <w:r>
-        <w:t xml:space="preserve">6. Build the production app</w:t>
-      </w:r>
-    </w:p>
-    <w:p>
-      <w:pPr>
-        <w:spacing w:after="120"/>
-      </w:pPr>
-      <w:r>
-        <w:t xml:space="preserve">Creates the optimised app (about 620 KB, fonts included, no internet needed) in the </w:t>
+        </w:rPr>
+        <w:t xml:space="preserve">IPv4 Address</w:t>
+      </w:r>
+      <w:r>
+        <w:t xml:space="preserve"> of the adapter connected to the network the tablet uses (currently </w:t>
       </w:r>
       <w:r>
         <w:rPr>
@@ -2956,10 +3351,129 @@
           <w:sz w:val="20"/>
           <w:szCs w:val="20"/>
         </w:rPr>
-        <w:t xml:space="preserve">dist</w:t>
-      </w:r>
-      <w:r>
-        <w:t xml:space="preserve"> folder. This is what gets copied to the cRIO.</w:t>
+        <w:t xml:space="preserve">192.168.0.7</w:t>
+      </w:r>
+      <w:r>
+        <w:t xml:space="preserve"> on "Ethernet"). Ignore </w:t>
+      </w:r>
+      <w:r>
+        <w:rPr>
+          <w:rFonts w:ascii="Consolas" w:cs="Consolas" w:eastAsia="Consolas" w:hAnsi="Consolas"/>
+          <w:color w:val="254229"/>
+          <w:sz w:val="20"/>
+          <w:szCs w:val="20"/>
+        </w:rPr>
+        <w:t xml:space="preserve">192.168.56.1</w:t>
+      </w:r>
+      <w:r>
+        <w:t xml:space="preserve">, which is a VirtualBox-only adapter.</w:t>
+      </w:r>
+    </w:p>
+    <w:p>
+      <w:pPr>
+        <w:pStyle w:val="Heading2"/>
+      </w:pPr>
+      <w:r>
+        <w:t xml:space="preserve">5.4 If the tablet cannot connect</w:t>
+      </w:r>
+    </w:p>
+    <w:p>
+      <w:pPr>
+        <w:pStyle w:val="ListParagraph"/>
+        <w:numPr>
+          <w:ilvl w:val="0"/>
+          <w:numId w:val="3"/>
+        </w:numPr>
+        <w:spacing w:after="60"/>
+      </w:pPr>
+      <w:r>
+        <w:t xml:space="preserve">Check the tablet and PC are on the same network, and that the URL starts with </w:t>
+      </w:r>
+      <w:r>
+        <w:rPr>
+          <w:rFonts w:ascii="Consolas" w:cs="Consolas" w:eastAsia="Consolas" w:hAnsi="Consolas"/>
+          <w:color w:val="254229"/>
+          <w:sz w:val="20"/>
+          <w:szCs w:val="20"/>
+        </w:rPr>
+        <w:t xml:space="preserve">http://</w:t>
+      </w:r>
+      <w:r>
+        <w:t xml:space="preserve"> (not https) and includes the port.</w:t>
+      </w:r>
+    </w:p>
+    <w:p>
+      <w:pPr>
+        <w:pStyle w:val="ListParagraph"/>
+        <w:numPr>
+          <w:ilvl w:val="0"/>
+          <w:numId w:val="3"/>
+        </w:numPr>
+        <w:spacing w:after="60"/>
+      </w:pPr>
+      <w:r>
+        <w:t xml:space="preserve">From this PC, open </w:t>
+      </w:r>
+      <w:r>
+        <w:rPr>
+          <w:rFonts w:ascii="Consolas" w:cs="Consolas" w:eastAsia="Consolas" w:hAnsi="Consolas"/>
+          <w:color w:val="254229"/>
+          <w:sz w:val="20"/>
+          <w:szCs w:val="20"/>
+        </w:rPr>
+        <w:t xml:space="preserve">http://192.168.0.7:5173</w:t>
+      </w:r>
+      <w:r>
+        <w:t xml:space="preserve">. If it works here but not on the tablet, the Windows Firewall is blocking it.</w:t>
+      </w:r>
+    </w:p>
+    <w:p>
+      <w:pPr>
+        <w:pStyle w:val="ListParagraph"/>
+        <w:numPr>
+          <w:ilvl w:val="0"/>
+          <w:numId w:val="3"/>
+        </w:numPr>
+        <w:spacing w:after="60"/>
+      </w:pPr>
+      <w:r>
+        <w:t xml:space="preserve">This PC's network is a </w:t>
+      </w:r>
+      <w:r>
+        <w:rPr>
+          <w:b/>
+          <w:bCs/>
+        </w:rPr>
+        <w:t xml:space="preserve">Domain</w:t>
+      </w:r>
+      <w:r>
+        <w:t xml:space="preserve"> network, where Node.js is already allowed. If the network profile changes to Private or Public, allow the ports once from an </w:t>
+      </w:r>
+      <w:r>
+        <w:rPr>
+          <w:b/>
+          <w:bCs/>
+        </w:rPr>
+        <w:t xml:space="preserve">Administrator</w:t>
+      </w:r>
+      <w:r>
+        <w:t xml:space="preserve"> PowerShell:</w:t>
+      </w:r>
+    </w:p>
+    <w:p>
+      <w:pPr>
+        <w:keepNext/>
+        <w:spacing w:after="0" w:before="60"/>
+      </w:pPr>
+      <w:r>
+        <w:rPr>
+          <w:i/>
+          <w:iCs/>
+          <w:color w:val="5F6B61"/>
+          <w:sz w:val="17"/>
+          <w:szCs w:val="17"/>
+        </w:rPr>
+        <w:t xml:space="preserve">Administrator PowerShell (one time)</w:t>
       </w:r>
     </w:p>
     <w:p>
@@ -2983,15 +3497,36 @@
           <w:sz w:val="19"/>
           <w:szCs w:val="19"/>
         </w:rPr>
-        <w:t xml:space="preserve">npm run build</w:t>
-      </w:r>
-    </w:p>
-    <w:p>
-      <w:pPr>
-        <w:pStyle w:val="Heading2"/>
-      </w:pPr>
-      <w:r>
-        <w:t xml:space="preserve">6.1 Preview the built app</w:t>
+        <w:t xml:space="preserve">New-NetFirewallRule -DisplayName "CARE UI (5173, 4173)" -Direction Inbound -Protocol TCP -LocalPort 5173,4173 -Action Allow</w:t>
+      </w:r>
+    </w:p>
+    <w:p>
+      <w:pPr>
+        <w:pBdr>
+          <w:left w:val="single" w:color="ED6C2A" w:sz="24" w:space="8"/>
+        </w:pBdr>
+        <w:shd w:fill="FDF1E8" w:color="auto" w:val="clear"/>
+        <w:spacing w:after="160" w:before="80" w:line="276"/>
+        <w:ind w:left="160" w:right="160"/>
+      </w:pPr>
+      <w:r>
+        <w:rPr>
+          <w:b/>
+          <w:bCs/>
+          <w:color w:val="B4531A"/>
+        </w:rPr>
+        <w:t xml:space="preserve">Important: </w:t>
+      </w:r>
+      <w:r>
+        <w:t xml:space="preserve">That command changes the firewall configuration of this PC. Run it yourself only if the tablet cannot connect.</w:t>
+      </w:r>
+    </w:p>
+    <w:p>
+      <w:pPr>
+        <w:pStyle w:val="Heading1"/>
+      </w:pPr>
+      <w:r>
+        <w:t xml:space="preserve">6. Build the production app</w:t>
       </w:r>
     </w:p>
     <w:p>
@@ -2999,7 +3534,7 @@
         <w:spacing w:after="120"/>
       </w:pPr>
       <w:r>
-        <w:t xml:space="preserve">Serves </w:t>
+        <w:t xml:space="preserve">Creates the optimised app (about 620 KB, fonts included, no internet needed) in the </w:t>
       </w:r>
       <w:r>
         <w:rPr>
@@ -3011,7 +3546,7 @@
         <w:t xml:space="preserve">dist</w:t>
       </w:r>
       <w:r>
-        <w:t xml:space="preserve"> exactly as the cRIO would, on this PC and the network:</w:t>
+        <w:t xml:space="preserve"> folder. This is what gets copied to the cRIO.</w:t>
       </w:r>
     </w:p>
     <w:p>
@@ -3035,6 +3570,58 @@
           <w:sz w:val="19"/>
           <w:szCs w:val="19"/>
         </w:rPr>
+        <w:t xml:space="preserve">npm run build</w:t>
+      </w:r>
+    </w:p>
+    <w:p>
+      <w:pPr>
+        <w:pStyle w:val="Heading2"/>
+      </w:pPr>
+      <w:r>
+        <w:t xml:space="preserve">6.1 Preview the built app</w:t>
+      </w:r>
+    </w:p>
+    <w:p>
+      <w:pPr>
+        <w:spacing w:after="120"/>
+      </w:pPr>
+      <w:r>
+        <w:t xml:space="preserve">Serves </w:t>
+      </w:r>
+      <w:r>
+        <w:rPr>
+          <w:rFonts w:ascii="Consolas" w:cs="Consolas" w:eastAsia="Consolas" w:hAnsi="Consolas"/>
+          <w:color w:val="254229"/>
+          <w:sz w:val="20"/>
+          <w:szCs w:val="20"/>
+        </w:rPr>
+        <w:t xml:space="preserve">dist</w:t>
+      </w:r>
+      <w:r>
+        <w:t xml:space="preserve"> exactly as the cRIO would, on this PC and the network:</w:t>
+      </w:r>
+    </w:p>
+    <w:p>
+      <w:pPr>
+        <w:keepNext w:val="false"/>
+        <w:keepLines/>
+        <w:pBdr>
+          <w:top w:val="single" w:color="C9D8C3" w:sz="6" w:space="4"/>
+          <w:bottom w:val="single" w:color="C9D8C3" w:sz="6" w:space="4"/>
+          <w:left w:val="single" w:color="639850" w:sz="18" w:space="6"/>
+          <w:right w:val="single" w:color="C9D8C3" w:sz="6" w:space="4"/>
+        </w:pBdr>
+        <w:shd w:fill="F3F6F1" w:color="auto" w:val="clear"/>
+        <w:spacing w:after="160" w:before="40" w:line="276"/>
+        <w:ind w:left="120" w:right="120"/>
+      </w:pPr>
+      <w:r>
+        <w:rPr>
+          <w:rFonts w:ascii="Consolas" w:cs="Consolas" w:eastAsia="Consolas" w:hAnsi="Consolas"/>
+          <w:color w:val="1B2E1D"/>
+          <w:sz w:val="19"/>
+          <w:szCs w:val="19"/>
+        </w:rPr>
         <w:t xml:space="preserve">npm run preview</w:t>
       </w:r>
     </w:p>
@@ -3187,7 +3774,7 @@
         <w:t xml:space="preserve">dist</w:t>
       </w:r>
       <w:r>
-        <w:t xml:space="preserve"> to the Public Content folder of the LabVIEW Web Service that implements </w:t>
+        <w:t xml:space="preserve"> to the Public Content folder of the LabVIEW Web Service that implements the </w:t>
       </w:r>
       <w:r>
         <w:rPr>
@@ -3196,10 +3783,10 @@
           <w:sz w:val="20"/>
           <w:szCs w:val="20"/>
         </w:rPr>
-        <w:t xml:space="preserve">/care/api</w:t>
-      </w:r>
-      <w:r>
-        <w:t xml:space="preserve">, using WinSCP or scp:</w:t>
+        <w:t xml:space="preserve">/api</w:t>
+      </w:r>
+      <w:r>
+        <w:t xml:space="preserve"> endpoints, using WinSCP or scp:</w:t>
       </w:r>
     </w:p>
     <w:p>
@@ -3461,7 +4048,7 @@
                 <w:sz w:val="20"/>
                 <w:szCs w:val="20"/>
               </w:rPr>
-              <w:t xml:space="preserve">mode: 'mock'</w:t>
+              <w:t xml:space="preserve">mode: 'crio'</w:t>
             </w:r>
           </w:p>
         </w:tc>
@@ -3483,7 +4070,19 @@
           </w:tcPr>
           <w:p>
             <w:r>
-              <w:t xml:space="preserve">Built-in simulator. No hardware needed (default).</w:t>
+              <w:t xml:space="preserve">Calls the API server: </w:t>
+            </w:r>
+            <w:r>
+              <w:rPr>
+                <w:rFonts w:ascii="Consolas" w:cs="Consolas" w:eastAsia="Consolas" w:hAnsi="Consolas"/>
+                <w:color w:val="254229"/>
+                <w:sz w:val="20"/>
+                <w:szCs w:val="20"/>
+              </w:rPr>
+              <w:t xml:space="preserve">python server/app.py</w:t>
+            </w:r>
+            <w:r>
+              <w:t xml:space="preserve"> (section 13) or the cRIO (default).</w:t>
             </w:r>
           </w:p>
         </w:tc>
@@ -3517,7 +4116,7 @@
                 <w:sz w:val="20"/>
                 <w:szCs w:val="20"/>
               </w:rPr>
-              <w:t xml:space="preserve">mode: 'crio'</w:t>
+              <w:t xml:space="preserve">mode: 'mock'</w:t>
             </w:r>
           </w:p>
         </w:tc>
@@ -3540,7 +4139,7 @@
           </w:tcPr>
           <w:p>
             <w:r>
-              <w:t xml:space="preserve">Talks to the LabVIEW Web Service on the cRIO.</w:t>
+              <w:t xml:space="preserve">Built-in simulator, no server needed (used for the GitHub Pages demo).</w:t>
             </w:r>
           </w:p>
         </w:tc>
@@ -3573,29 +4172,10 @@
                 <w:sz w:val="20"/>
                 <w:szCs w:val="20"/>
               </w:rPr>
-              <w:t xml:space="preserve">apiBase: ''</w:t>
-            </w:r>
-          </w:p>
-        </w:tc>
-        <w:tc>
-          <w:tcPr>
-            <w:tcW w:type="dxa" w:w="6026"/>
-            <w:tcBorders>
-              <w:top w:val="single" w:color="C9D8C3" w:sz="4"/>
-              <w:left w:val="single" w:color="C9D8C3" w:sz="4"/>
-              <w:bottom w:val="single" w:color="C9D8C3" w:sz="4"/>
-              <w:right w:val="single" w:color="C9D8C3" w:sz="4"/>
-            </w:tcBorders>
-            <w:tcMar>
-              <w:top w:type="dxa" w:w="70"/>
-              <w:left w:type="dxa" w:w="110"/>
-              <w:bottom w:type="dxa" w:w="70"/>
-              <w:right w:type="dxa" w:w="110"/>
-            </w:tcMar>
-          </w:tcPr>
-          <w:p>
-            <w:r>
-              <w:t xml:space="preserve">Empty = same host that served the page. Set e.g. </w:t>
+              <w:t xml:space="preserve">?mode=crio</w:t>
+            </w:r>
+            <w:r>
+              <w:t xml:space="preserve"> / </w:t>
             </w:r>
             <w:r>
               <w:rPr>
@@ -3604,10 +4184,53 @@
                 <w:sz w:val="20"/>
                 <w:szCs w:val="20"/>
               </w:rPr>
-              <w:t xml:space="preserve">'http://192.168.1.50:8001'</w:t>
-            </w:r>
-            <w:r>
-              <w:t xml:space="preserve"> if the UI is served from elsewhere.</w:t>
+              <w:t xml:space="preserve">?mode=mock</w:t>
+            </w:r>
+          </w:p>
+        </w:tc>
+        <w:tc>
+          <w:tcPr>
+            <w:tcW w:type="dxa" w:w="6026"/>
+            <w:tcBorders>
+              <w:top w:val="single" w:color="C9D8C3" w:sz="4"/>
+              <w:left w:val="single" w:color="C9D8C3" w:sz="4"/>
+              <w:bottom w:val="single" w:color="C9D8C3" w:sz="4"/>
+              <w:right w:val="single" w:color="C9D8C3" w:sz="4"/>
+            </w:tcBorders>
+            <w:tcMar>
+              <w:top w:type="dxa" w:w="70"/>
+              <w:left w:type="dxa" w:w="110"/>
+              <w:bottom w:type="dxa" w:w="70"/>
+              <w:right w:type="dxa" w:w="110"/>
+            </w:tcMar>
+          </w:tcPr>
+          <w:p>
+            <w:r>
+              <w:t xml:space="preserve">Added to the page address, overrides </w:t>
+            </w:r>
+            <w:r>
+              <w:rPr>
+                <w:rFonts w:ascii="Consolas" w:cs="Consolas" w:eastAsia="Consolas" w:hAnsi="Consolas"/>
+                <w:color w:val="254229"/>
+                <w:sz w:val="20"/>
+                <w:szCs w:val="20"/>
+              </w:rPr>
+              <w:t xml:space="preserve">mode</w:t>
+            </w:r>
+            <w:r>
+              <w:t xml:space="preserve"> without editing the file (e.g. </w:t>
+            </w:r>
+            <w:r>
+              <w:rPr>
+                <w:rFonts w:ascii="Consolas" w:cs="Consolas" w:eastAsia="Consolas" w:hAnsi="Consolas"/>
+                <w:color w:val="254229"/>
+                <w:sz w:val="20"/>
+                <w:szCs w:val="20"/>
+              </w:rPr>
+              <w:t xml:space="preserve">http://&lt;ip&gt;:5173/?mode=crio</w:t>
+            </w:r>
+            <w:r>
+              <w:t xml:space="preserve">).</w:t>
             </w:r>
           </w:p>
         </w:tc>
@@ -3641,10 +4264,30 @@
                 <w:sz w:val="20"/>
                 <w:szCs w:val="20"/>
               </w:rPr>
-              <w:t xml:space="preserve">statusPollMs</w:t>
-            </w:r>
-            <w:r>
-              <w:t xml:space="preserve">, </w:t>
+              <w:t xml:space="preserve">apiBase: ''</w:t>
+            </w:r>
+          </w:p>
+        </w:tc>
+        <w:tc>
+          <w:tcPr>
+            <w:tcW w:type="dxa" w:w="6026"/>
+            <w:tcBorders>
+              <w:top w:val="single" w:color="C9D8C3" w:sz="4"/>
+              <w:left w:val="single" w:color="C9D8C3" w:sz="4"/>
+              <w:bottom w:val="single" w:color="C9D8C3" w:sz="4"/>
+              <w:right w:val="single" w:color="C9D8C3" w:sz="4"/>
+            </w:tcBorders>
+            <w:shd w:fill="F6F9F4" w:color="auto" w:val="clear"/>
+            <w:tcMar>
+              <w:top w:type="dxa" w:w="70"/>
+              <w:left w:type="dxa" w:w="110"/>
+              <w:bottom w:type="dxa" w:w="70"/>
+              <w:right w:type="dxa" w:w="110"/>
+            </w:tcMar>
+          </w:tcPr>
+          <w:p>
+            <w:r>
+              <w:t xml:space="preserve">Empty = same host that served the page. Set e.g. </w:t>
             </w:r>
             <w:r>
               <w:rPr>
@@ -3653,30 +4296,10 @@
                 <w:sz w:val="20"/>
                 <w:szCs w:val="20"/>
               </w:rPr>
-              <w:t xml:space="preserve">jogRepeatMs</w:t>
-            </w:r>
-          </w:p>
-        </w:tc>
-        <w:tc>
-          <w:tcPr>
-            <w:tcW w:type="dxa" w:w="6026"/>
-            <w:tcBorders>
-              <w:top w:val="single" w:color="C9D8C3" w:sz="4"/>
-              <w:left w:val="single" w:color="C9D8C3" w:sz="4"/>
-              <w:bottom w:val="single" w:color="C9D8C3" w:sz="4"/>
-              <w:right w:val="single" w:color="C9D8C3" w:sz="4"/>
-            </w:tcBorders>
-            <w:shd w:fill="F6F9F4" w:color="auto" w:val="clear"/>
-            <w:tcMar>
-              <w:top w:type="dxa" w:w="70"/>
-              <w:left w:type="dxa" w:w="110"/>
-              <w:bottom w:type="dxa" w:w="70"/>
-              <w:right w:type="dxa" w:w="110"/>
-            </w:tcMar>
-          </w:tcPr>
-          <w:p>
-            <w:r>
-              <w:t xml:space="preserve">Telemetry poll rate and jog re-send interval (ms).</w:t>
+              <w:t xml:space="preserve">'http://192.168.1.50:8001'</w:t>
+            </w:r>
+            <w:r>
+              <w:t xml:space="preserve"> if the UI is served from elsewhere.</w:t>
             </w:r>
           </w:p>
         </w:tc>
@@ -3709,6 +4332,74 @@
                 <w:sz w:val="20"/>
                 <w:szCs w:val="20"/>
               </w:rPr>
+              <w:t xml:space="preserve">statusPollMs</w:t>
+            </w:r>
+            <w:r>
+              <w:t xml:space="preserve">, </w:t>
+            </w:r>
+            <w:r>
+              <w:rPr>
+                <w:rFonts w:ascii="Consolas" w:cs="Consolas" w:eastAsia="Consolas" w:hAnsi="Consolas"/>
+                <w:color w:val="254229"/>
+                <w:sz w:val="20"/>
+                <w:szCs w:val="20"/>
+              </w:rPr>
+              <w:t xml:space="preserve">jogRepeatMs</w:t>
+            </w:r>
+          </w:p>
+        </w:tc>
+        <w:tc>
+          <w:tcPr>
+            <w:tcW w:type="dxa" w:w="6026"/>
+            <w:tcBorders>
+              <w:top w:val="single" w:color="C9D8C3" w:sz="4"/>
+              <w:left w:val="single" w:color="C9D8C3" w:sz="4"/>
+              <w:bottom w:val="single" w:color="C9D8C3" w:sz="4"/>
+              <w:right w:val="single" w:color="C9D8C3" w:sz="4"/>
+            </w:tcBorders>
+            <w:tcMar>
+              <w:top w:type="dxa" w:w="70"/>
+              <w:left w:type="dxa" w:w="110"/>
+              <w:bottom w:type="dxa" w:w="70"/>
+              <w:right w:type="dxa" w:w="110"/>
+            </w:tcMar>
+          </w:tcPr>
+          <w:p>
+            <w:r>
+              <w:t xml:space="preserve">Telemetry poll rate and jog re-send interval (ms).</w:t>
+            </w:r>
+          </w:p>
+        </w:tc>
+      </w:tr>
+      <w:tr>
+        <w:trPr>
+          <w:cantSplit/>
+        </w:trPr>
+        <w:tc>
+          <w:tcPr>
+            <w:tcW w:type="dxa" w:w="3000"/>
+            <w:tcBorders>
+              <w:top w:val="single" w:color="C9D8C3" w:sz="4"/>
+              <w:left w:val="single" w:color="C9D8C3" w:sz="4"/>
+              <w:bottom w:val="single" w:color="C9D8C3" w:sz="4"/>
+              <w:right w:val="single" w:color="C9D8C3" w:sz="4"/>
+            </w:tcBorders>
+            <w:shd w:fill="F6F9F4" w:color="auto" w:val="clear"/>
+            <w:tcMar>
+              <w:top w:type="dxa" w:w="70"/>
+              <w:left w:type="dxa" w:w="110"/>
+              <w:bottom w:type="dxa" w:w="70"/>
+              <w:right w:type="dxa" w:w="110"/>
+            </w:tcMar>
+          </w:tcPr>
+          <w:p>
+            <w:r>
+              <w:rPr>
+                <w:rFonts w:ascii="Consolas" w:cs="Consolas" w:eastAsia="Consolas" w:hAnsi="Consolas"/>
+                <w:color w:val="254229"/>
+                <w:sz w:val="20"/>
+                <w:szCs w:val="20"/>
+              </w:rPr>
               <w:t xml:space="preserve">offloading</w:t>
             </w:r>
           </w:p>
@@ -3722,6 +4413,7 @@
               <w:bottom w:val="single" w:color="C9D8C3" w:sz="4"/>
               <w:right w:val="single" w:color="C9D8C3" w:sz="4"/>
             </w:tcBorders>
+            <w:shd w:fill="F6F9F4" w:color="auto" w:val="clear"/>
             <w:tcMar>
               <w:top w:type="dxa" w:w="70"/>
               <w:left w:type="dxa" w:w="110"/>
@@ -5557,27 +6249,54 @@
         <w:spacing w:after="60"/>
       </w:pPr>
       <w:r>
-        <w:t xml:space="preserve">If the Actions run fails, open it to see the error; most often Pages was not set to </w:t>
-      </w:r>
-      <w:r>
         <w:rPr>
           <w:b/>
           <w:bCs/>
         </w:rPr>
-        <w:t xml:space="preserve">GitHub Actions</w:t>
-      </w:r>
-      <w:r>
-        <w:t xml:space="preserve"> (step 12.1-3). Fix it, then use </w:t>
+        <w:t xml:space="preserve">Site shows only a dark-green screen</w:t>
+      </w:r>
+      <w:r>
+        <w:t xml:space="preserve"> (newer versions show "CARE 2.0 did not start"): GitHub is publishing the raw source instead of the built app. In </w:t>
       </w:r>
       <w:r>
         <w:rPr>
           <w:b/>
           <w:bCs/>
         </w:rPr>
-        <w:t xml:space="preserve">Run workflow</w:t>
-      </w:r>
-      <w:r>
-        <w:t xml:space="preserve"> on the Actions tab to try again.</w:t>
+        <w:t xml:space="preserve">Settings → Pages</w:t>
+      </w:r>
+      <w:r>
+        <w:t xml:space="preserve"> set </w:t>
+      </w:r>
+      <w:r>
+        <w:rPr>
+          <w:b/>
+          <w:bCs/>
+        </w:rPr>
+        <w:t xml:space="preserve">Source</w:t>
+      </w:r>
+      <w:r>
+        <w:t xml:space="preserve"> to </w:t>
+      </w:r>
+      <w:r>
+        <w:rPr>
+          <w:b/>
+          <w:bCs/>
+        </w:rPr>
+        <w:t xml:space="preserve">GitHub Actions</w:t>
+      </w:r>
+      <w:r>
+        <w:t xml:space="preserve"> (not "Deploy from a branch"), run </w:t>
+      </w:r>
+      <w:r>
+        <w:rPr>
+          <w:b/>
+          <w:bCs/>
+        </w:rPr>
+        <w:t xml:space="preserve">Deploy to GitHub Pages</w:t>
+      </w:r>
+      <w:r>
+        <w:t xml:space="preserve"> again on the Actions tab, then reload the site (a private tab avoids the cached page).</w:t>
       </w:r>
     </w:p>
     <w:p>
@@ -5590,17 +6309,1101 @@
         <w:spacing w:after="60"/>
       </w:pPr>
       <w:r>
-        <w:t xml:space="preserve">To take the site offline: </w:t>
+        <w:t xml:space="preserve">If the Actions run fails, open it to see the error; most often Pages was not set to </w:t>
       </w:r>
       <w:r>
         <w:rPr>
           <w:b/>
           <w:bCs/>
         </w:rPr>
+        <w:t xml:space="preserve">GitHub Actions</w:t>
+      </w:r>
+      <w:r>
+        <w:t xml:space="preserve"> (step 12.1-3). Fix it, then use </w:t>
+      </w:r>
+      <w:r>
+        <w:rPr>
+          <w:b/>
+          <w:bCs/>
+        </w:rPr>
+        <w:t xml:space="preserve">Run workflow</w:t>
+      </w:r>
+      <w:r>
+        <w:t xml:space="preserve"> on the Actions tab to try again.</w:t>
+      </w:r>
+    </w:p>
+    <w:p>
+      <w:pPr>
+        <w:pStyle w:val="ListParagraph"/>
+        <w:numPr>
+          <w:ilvl w:val="0"/>
+          <w:numId w:val="3"/>
+        </w:numPr>
+        <w:spacing w:after="60"/>
+      </w:pPr>
+      <w:r>
+        <w:t xml:space="preserve">To take the site offline: </w:t>
+      </w:r>
+      <w:r>
+        <w:rPr>
+          <w:b/>
+          <w:bCs/>
+        </w:rPr>
         <w:t xml:space="preserve">Settings → Pages → Unpublish site</w:t>
       </w:r>
       <w:r>
         <w:t xml:space="preserve"> (or delete the repository).</w:t>
+      </w:r>
+    </w:p>
+    <w:p>
+      <w:pPr>
+        <w:pStyle w:val="Heading1"/>
+      </w:pPr>
+      <w:r>
+        <w:t xml:space="preserve">13. API server</w:t>
+      </w:r>
+    </w:p>
+    <w:p>
+      <w:pPr>
+        <w:spacing w:after="120"/>
+      </w:pPr>
+      <w:r>
+        <w:t xml:space="preserve">The UI gets all its data by calling the API server, </w:t>
+      </w:r>
+      <w:r>
+        <w:rPr>
+          <w:rFonts w:ascii="Consolas" w:cs="Consolas" w:eastAsia="Consolas" w:hAnsi="Consolas"/>
+          <w:color w:val="254229"/>
+          <w:sz w:val="20"/>
+          <w:szCs w:val="20"/>
+        </w:rPr>
+        <w:t xml:space="preserve">server/app.py</w:t>
+      </w:r>
+      <w:r>
+        <w:t xml:space="preserve">. It uses only the Python standard library. The APIs, requests, responses and status codes are listed in </w:t>
+      </w:r>
+      <w:r>
+        <w:rPr>
+          <w:rFonts w:ascii="Consolas" w:cs="Consolas" w:eastAsia="Consolas" w:hAnsi="Consolas"/>
+          <w:color w:val="254229"/>
+          <w:sz w:val="20"/>
+          <w:szCs w:val="20"/>
+        </w:rPr>
+        <w:t xml:space="preserve">docs/CRIO_API.md</w:t>
+      </w:r>
+      <w:r>
+        <w:t xml:space="preserve">.</w:t>
+      </w:r>
+    </w:p>
+    <w:p>
+      <w:pPr>
+        <w:pStyle w:val="ListParagraph"/>
+        <w:numPr>
+          <w:ilvl w:val="0"/>
+          <w:numId w:val="10"/>
+        </w:numPr>
+        <w:spacing w:after="60"/>
+      </w:pPr>
+      <w:r>
+        <w:t xml:space="preserve">Start the API server and leave it running:</w:t>
+      </w:r>
+    </w:p>
+    <w:p>
+      <w:pPr>
+        <w:keepNext/>
+        <w:spacing w:after="0" w:before="60"/>
+      </w:pPr>
+      <w:r>
+        <w:rPr>
+          <w:i/>
+          <w:iCs/>
+          <w:color w:val="5F6B61"/>
+          <w:sz w:val="17"/>
+          <w:szCs w:val="17"/>
+        </w:rPr>
+        <w:t xml:space="preserve">Terminal 1, in the care-ui folder</w:t>
+      </w:r>
+    </w:p>
+    <w:p>
+      <w:pPr>
+        <w:keepNext w:val="false"/>
+        <w:keepLines/>
+        <w:pBdr>
+          <w:top w:val="single" w:color="C9D8C3" w:sz="6" w:space="4"/>
+          <w:bottom w:val="single" w:color="C9D8C3" w:sz="6" w:space="4"/>
+          <w:left w:val="single" w:color="639850" w:sz="18" w:space="6"/>
+          <w:right w:val="single" w:color="C9D8C3" w:sz="6" w:space="4"/>
+        </w:pBdr>
+        <w:shd w:fill="F3F6F1" w:color="auto" w:val="clear"/>
+        <w:spacing w:after="160" w:before="40" w:line="276"/>
+        <w:ind w:left="120" w:right="120"/>
+      </w:pPr>
+      <w:r>
+        <w:rPr>
+          <w:rFonts w:ascii="Consolas" w:cs="Consolas" w:eastAsia="Consolas" w:hAnsi="Consolas"/>
+          <w:color w:val="1B2E1D"/>
+          <w:sz w:val="19"/>
+          <w:szCs w:val="19"/>
+        </w:rPr>
+        <w:t xml:space="preserve">python server/app.py</w:t>
+      </w:r>
+    </w:p>
+    <w:p>
+      <w:pPr>
+        <w:pStyle w:val="ListParagraph"/>
+        <w:numPr>
+          <w:ilvl w:val="0"/>
+          <w:numId w:val="10"/>
+        </w:numPr>
+        <w:spacing w:after="60"/>
+      </w:pPr>
+      <w:r>
+        <w:t xml:space="preserve">Start the UI in a second terminal:</w:t>
+      </w:r>
+    </w:p>
+    <w:p>
+      <w:pPr>
+        <w:keepNext/>
+        <w:spacing w:after="0" w:before="60"/>
+      </w:pPr>
+      <w:r>
+        <w:rPr>
+          <w:i/>
+          <w:iCs/>
+          <w:color w:val="5F6B61"/>
+          <w:sz w:val="17"/>
+          <w:szCs w:val="17"/>
+        </w:rPr>
+        <w:t xml:space="preserve">Terminal 2, in the care-ui folder</w:t>
+      </w:r>
+    </w:p>
+    <w:p>
+      <w:pPr>
+        <w:keepNext w:val="false"/>
+        <w:keepLines/>
+        <w:pBdr>
+          <w:top w:val="single" w:color="C9D8C3" w:sz="6" w:space="4"/>
+          <w:bottom w:val="single" w:color="C9D8C3" w:sz="6" w:space="4"/>
+          <w:left w:val="single" w:color="639850" w:sz="18" w:space="6"/>
+          <w:right w:val="single" w:color="C9D8C3" w:sz="6" w:space="4"/>
+        </w:pBdr>
+        <w:shd w:fill="F3F6F1" w:color="auto" w:val="clear"/>
+        <w:spacing w:after="160" w:before="40" w:line="276"/>
+        <w:ind w:left="120" w:right="120"/>
+      </w:pPr>
+      <w:r>
+        <w:rPr>
+          <w:rFonts w:ascii="Consolas" w:cs="Consolas" w:eastAsia="Consolas" w:hAnsi="Consolas"/>
+          <w:color w:val="1B2E1D"/>
+          <w:sz w:val="19"/>
+          <w:szCs w:val="19"/>
+        </w:rPr>
+        <w:t xml:space="preserve">npm run dev</w:t>
+      </w:r>
+    </w:p>
+    <w:p>
+      <w:pPr>
+        <w:pStyle w:val="ListParagraph"/>
+        <w:numPr>
+          <w:ilvl w:val="0"/>
+          <w:numId w:val="10"/>
+        </w:numPr>
+        <w:spacing w:after="60"/>
+      </w:pPr>
+      <w:r>
+        <w:t xml:space="preserve">On the tablet open </w:t>
+      </w:r>
+      <w:r>
+        <w:rPr>
+          <w:rFonts w:ascii="Consolas" w:cs="Consolas" w:eastAsia="Consolas" w:hAnsi="Consolas"/>
+          <w:color w:val="254229"/>
+          <w:sz w:val="20"/>
+          <w:szCs w:val="20"/>
+        </w:rPr>
+        <w:t xml:space="preserve">http://192.168.0.7:5173</w:t>
+      </w:r>
+      <w:r>
+        <w:t xml:space="preserve">. The UI sends its API calls to port 5173, which forwards them to the server on port 8000. Log in with </w:t>
+      </w:r>
+      <w:r>
+        <w:rPr>
+          <w:rFonts w:ascii="Consolas" w:cs="Consolas" w:eastAsia="Consolas" w:hAnsi="Consolas"/>
+          <w:color w:val="254229"/>
+          <w:sz w:val="20"/>
+          <w:szCs w:val="20"/>
+        </w:rPr>
+        <w:t xml:space="preserve">preethi</w:t>
+      </w:r>
+      <w:r>
+        <w:t xml:space="preserve"> / </w:t>
+      </w:r>
+      <w:r>
+        <w:rPr>
+          <w:rFonts w:ascii="Consolas" w:cs="Consolas" w:eastAsia="Consolas" w:hAnsi="Consolas"/>
+          <w:color w:val="254229"/>
+          <w:sz w:val="20"/>
+          <w:szCs w:val="20"/>
+        </w:rPr>
+        <w:t xml:space="preserve">1234</w:t>
+      </w:r>
+      <w:r>
+        <w:t xml:space="preserve"> or </w:t>
+      </w:r>
+      <w:r>
+        <w:rPr>
+          <w:rFonts w:ascii="Consolas" w:cs="Consolas" w:eastAsia="Consolas" w:hAnsi="Consolas"/>
+          <w:color w:val="254229"/>
+          <w:sz w:val="20"/>
+          <w:szCs w:val="20"/>
+        </w:rPr>
+        <w:t xml:space="preserve">admin</w:t>
+      </w:r>
+      <w:r>
+        <w:t xml:space="preserve"> / </w:t>
+      </w:r>
+      <w:r>
+        <w:rPr>
+          <w:rFonts w:ascii="Consolas" w:cs="Consolas" w:eastAsia="Consolas" w:hAnsi="Consolas"/>
+          <w:color w:val="254229"/>
+          <w:sz w:val="20"/>
+          <w:szCs w:val="20"/>
+        </w:rPr>
+        <w:t xml:space="preserve">admin</w:t>
+      </w:r>
+      <w:r>
+        <w:t xml:space="preserve">.</w:t>
+      </w:r>
+    </w:p>
+    <w:p>
+      <w:pPr>
+        <w:pStyle w:val="ListParagraph"/>
+        <w:numPr>
+          <w:ilvl w:val="0"/>
+          <w:numId w:val="10"/>
+        </w:numPr>
+        <w:spacing w:after="60"/>
+      </w:pPr>
+      <w:r>
+        <w:t xml:space="preserve">Stop either one with </w:t>
+      </w:r>
+      <w:r>
+        <w:rPr>
+          <w:rFonts w:ascii="Consolas" w:cs="Consolas" w:eastAsia="Consolas" w:hAnsi="Consolas"/>
+          <w:color w:val="254229"/>
+          <w:sz w:val="20"/>
+          <w:szCs w:val="20"/>
+        </w:rPr>
+        <w:t xml:space="preserve">Ctrl + C</w:t>
+      </w:r>
+      <w:r>
+        <w:t xml:space="preserve">.</w:t>
+      </w:r>
+    </w:p>
+    <w:p>
+      <w:pPr>
+        <w:pStyle w:val="ListParagraph"/>
+        <w:numPr>
+          <w:ilvl w:val="0"/>
+          <w:numId w:val="3"/>
+        </w:numPr>
+        <w:spacing w:after="60"/>
+      </w:pPr>
+      <w:r>
+        <w:t xml:space="preserve">Data is stored in </w:t>
+      </w:r>
+      <w:r>
+        <w:rPr>
+          <w:rFonts w:ascii="Consolas" w:cs="Consolas" w:eastAsia="Consolas" w:hAnsi="Consolas"/>
+          <w:color w:val="254229"/>
+          <w:sz w:val="20"/>
+          <w:szCs w:val="20"/>
+        </w:rPr>
+        <w:t xml:space="preserve">server/care.db</w:t>
+      </w:r>
+      <w:r>
+        <w:t xml:space="preserve">, using the CARE 2.0 database schema (tables listed in </w:t>
+      </w:r>
+      <w:r>
+        <w:rPr>
+          <w:rFonts w:ascii="Consolas" w:cs="Consolas" w:eastAsia="Consolas" w:hAnsi="Consolas"/>
+          <w:color w:val="254229"/>
+          <w:sz w:val="20"/>
+          <w:szCs w:val="20"/>
+        </w:rPr>
+        <w:t xml:space="preserve">docs/CRIO_API.md</w:t>
+      </w:r>
+      <w:r>
+        <w:t xml:space="preserve">). Delete it (with the server stopped) to start again with the demo data.</w:t>
+      </w:r>
+    </w:p>
+    <w:p>
+      <w:pPr>
+        <w:pStyle w:val="ListParagraph"/>
+        <w:numPr>
+          <w:ilvl w:val="0"/>
+          <w:numId w:val="3"/>
+        </w:numPr>
+        <w:spacing w:after="60"/>
+      </w:pPr>
+      <w:r>
+        <w:t xml:space="preserve">If the UI shows "Cannot reach the device", the API server is not running.</w:t>
+      </w:r>
+    </w:p>
+    <w:p>
+      <w:pPr>
+        <w:spacing w:after="80"/>
+      </w:pPr>
+    </w:p>
+    <w:tbl>
+      <w:tblPr>
+        <w:tblW w:type="dxa" w:w="9026"/>
+        <w:tblBorders>
+          <w:top w:val="single" w:color="auto" w:sz="4"/>
+          <w:left w:val="single" w:color="auto" w:sz="4"/>
+          <w:bottom w:val="single" w:color="auto" w:sz="4"/>
+          <w:right w:val="single" w:color="auto" w:sz="4"/>
+          <w:insideH w:val="single" w:color="auto" w:sz="4"/>
+          <w:insideV w:val="single" w:color="auto" w:sz="4"/>
+        </w:tblBorders>
+      </w:tblPr>
+      <w:tblGrid>
+        <w:gridCol w:w="3600"/>
+        <w:gridCol w:w="5426"/>
+      </w:tblGrid>
+      <w:tr>
+        <w:trPr>
+          <w:tblHeader/>
+        </w:trPr>
+        <w:tc>
+          <w:tcPr>
+            <w:tcW w:type="dxa" w:w="3600"/>
+            <w:tcBorders>
+              <w:top w:val="single" w:color="C9D8C3" w:sz="4"/>
+              <w:left w:val="single" w:color="C9D8C3" w:sz="4"/>
+              <w:bottom w:val="single" w:color="C9D8C3" w:sz="4"/>
+              <w:right w:val="single" w:color="C9D8C3" w:sz="4"/>
+            </w:tcBorders>
+            <w:shd w:fill="254229" w:color="auto" w:val="clear"/>
+            <w:tcMar>
+              <w:top w:type="dxa" w:w="70"/>
+              <w:left w:type="dxa" w:w="110"/>
+              <w:bottom w:type="dxa" w:w="70"/>
+              <w:right w:type="dxa" w:w="110"/>
+            </w:tcMar>
+          </w:tcPr>
+          <w:p>
+            <w:r>
+              <w:rPr>
+                <w:b/>
+                <w:bCs/>
+                <w:color w:val="FFFFFF"/>
+                <w:sz w:val="19"/>
+                <w:szCs w:val="19"/>
+              </w:rPr>
+              <w:t xml:space="preserve">UI action</w:t>
+            </w:r>
+          </w:p>
+        </w:tc>
+        <w:tc>
+          <w:tcPr>
+            <w:tcW w:type="dxa" w:w="5426"/>
+            <w:tcBorders>
+              <w:top w:val="single" w:color="C9D8C3" w:sz="4"/>
+              <w:left w:val="single" w:color="C9D8C3" w:sz="4"/>
+              <w:bottom w:val="single" w:color="C9D8C3" w:sz="4"/>
+              <w:right w:val="single" w:color="C9D8C3" w:sz="4"/>
+            </w:tcBorders>
+            <w:shd w:fill="254229" w:color="auto" w:val="clear"/>
+            <w:tcMar>
+              <w:top w:type="dxa" w:w="70"/>
+              <w:left w:type="dxa" w:w="110"/>
+              <w:bottom w:type="dxa" w:w="70"/>
+              <w:right w:type="dxa" w:w="110"/>
+            </w:tcMar>
+          </w:tcPr>
+          <w:p>
+            <w:r>
+              <w:rPr>
+                <w:b/>
+                <w:bCs/>
+                <w:color w:val="FFFFFF"/>
+                <w:sz w:val="19"/>
+                <w:szCs w:val="19"/>
+              </w:rPr>
+              <w:t xml:space="preserve">API</w:t>
+            </w:r>
+          </w:p>
+        </w:tc>
+      </w:tr>
+      <w:tr>
+        <w:trPr>
+          <w:cantSplit/>
+        </w:trPr>
+        <w:tc>
+          <w:tcPr>
+            <w:tcW w:type="dxa" w:w="3600"/>
+            <w:tcBorders>
+              <w:top w:val="single" w:color="C9D8C3" w:sz="4"/>
+              <w:left w:val="single" w:color="C9D8C3" w:sz="4"/>
+              <w:bottom w:val="single" w:color="C9D8C3" w:sz="4"/>
+              <w:right w:val="single" w:color="C9D8C3" w:sz="4"/>
+            </w:tcBorders>
+            <w:tcMar>
+              <w:top w:type="dxa" w:w="70"/>
+              <w:left w:type="dxa" w:w="110"/>
+              <w:bottom w:type="dxa" w:w="70"/>
+              <w:right w:type="dxa" w:w="110"/>
+            </w:tcMar>
+          </w:tcPr>
+          <w:p>
+            <w:r>
+              <w:t xml:space="preserve">Login</w:t>
+            </w:r>
+          </w:p>
+        </w:tc>
+        <w:tc>
+          <w:tcPr>
+            <w:tcW w:type="dxa" w:w="5426"/>
+            <w:tcBorders>
+              <w:top w:val="single" w:color="C9D8C3" w:sz="4"/>
+              <w:left w:val="single" w:color="C9D8C3" w:sz="4"/>
+              <w:bottom w:val="single" w:color="C9D8C3" w:sz="4"/>
+              <w:right w:val="single" w:color="C9D8C3" w:sz="4"/>
+            </w:tcBorders>
+            <w:tcMar>
+              <w:top w:type="dxa" w:w="70"/>
+              <w:left w:type="dxa" w:w="110"/>
+              <w:bottom w:type="dxa" w:w="70"/>
+              <w:right w:type="dxa" w:w="110"/>
+            </w:tcMar>
+          </w:tcPr>
+          <w:p>
+            <w:r>
+              <w:rPr>
+                <w:rFonts w:ascii="Consolas" w:cs="Consolas" w:eastAsia="Consolas" w:hAnsi="Consolas"/>
+                <w:color w:val="254229"/>
+                <w:sz w:val="20"/>
+                <w:szCs w:val="20"/>
+              </w:rPr>
+              <w:t xml:space="preserve">POST /api/auth/login</w:t>
+            </w:r>
+          </w:p>
+        </w:tc>
+      </w:tr>
+      <w:tr>
+        <w:trPr>
+          <w:cantSplit/>
+        </w:trPr>
+        <w:tc>
+          <w:tcPr>
+            <w:tcW w:type="dxa" w:w="3600"/>
+            <w:tcBorders>
+              <w:top w:val="single" w:color="C9D8C3" w:sz="4"/>
+              <w:left w:val="single" w:color="C9D8C3" w:sz="4"/>
+              <w:bottom w:val="single" w:color="C9D8C3" w:sz="4"/>
+              <w:right w:val="single" w:color="C9D8C3" w:sz="4"/>
+            </w:tcBorders>
+            <w:shd w:fill="F6F9F4" w:color="auto" w:val="clear"/>
+            <w:tcMar>
+              <w:top w:type="dxa" w:w="70"/>
+              <w:left w:type="dxa" w:w="110"/>
+              <w:bottom w:type="dxa" w:w="70"/>
+              <w:right w:type="dxa" w:w="110"/>
+            </w:tcMar>
+          </w:tcPr>
+          <w:p>
+            <w:r>
+              <w:t xml:space="preserve">Create account</w:t>
+            </w:r>
+          </w:p>
+        </w:tc>
+        <w:tc>
+          <w:tcPr>
+            <w:tcW w:type="dxa" w:w="5426"/>
+            <w:tcBorders>
+              <w:top w:val="single" w:color="C9D8C3" w:sz="4"/>
+              <w:left w:val="single" w:color="C9D8C3" w:sz="4"/>
+              <w:bottom w:val="single" w:color="C9D8C3" w:sz="4"/>
+              <w:right w:val="single" w:color="C9D8C3" w:sz="4"/>
+            </w:tcBorders>
+            <w:shd w:fill="F6F9F4" w:color="auto" w:val="clear"/>
+            <w:tcMar>
+              <w:top w:type="dxa" w:w="70"/>
+              <w:left w:type="dxa" w:w="110"/>
+              <w:bottom w:type="dxa" w:w="70"/>
+              <w:right w:type="dxa" w:w="110"/>
+            </w:tcMar>
+          </w:tcPr>
+          <w:p>
+            <w:r>
+              <w:rPr>
+                <w:rFonts w:ascii="Consolas" w:cs="Consolas" w:eastAsia="Consolas" w:hAnsi="Consolas"/>
+                <w:color w:val="254229"/>
+                <w:sz w:val="20"/>
+                <w:szCs w:val="20"/>
+              </w:rPr>
+              <w:t xml:space="preserve">POST /api/therapists/register</w:t>
+            </w:r>
+          </w:p>
+        </w:tc>
+      </w:tr>
+      <w:tr>
+        <w:trPr>
+          <w:cantSplit/>
+        </w:trPr>
+        <w:tc>
+          <w:tcPr>
+            <w:tcW w:type="dxa" w:w="3600"/>
+            <w:tcBorders>
+              <w:top w:val="single" w:color="C9D8C3" w:sz="4"/>
+              <w:left w:val="single" w:color="C9D8C3" w:sz="4"/>
+              <w:bottom w:val="single" w:color="C9D8C3" w:sz="4"/>
+              <w:right w:val="single" w:color="C9D8C3" w:sz="4"/>
+            </w:tcBorders>
+            <w:tcMar>
+              <w:top w:type="dxa" w:w="70"/>
+              <w:left w:type="dxa" w:w="110"/>
+              <w:bottom w:type="dxa" w:w="70"/>
+              <w:right w:type="dxa" w:w="110"/>
+            </w:tcMar>
+          </w:tcPr>
+          <w:p>
+            <w:r>
+              <w:t xml:space="preserve">Patient list / select patient</w:t>
+            </w:r>
+          </w:p>
+        </w:tc>
+        <w:tc>
+          <w:tcPr>
+            <w:tcW w:type="dxa" w:w="5426"/>
+            <w:tcBorders>
+              <w:top w:val="single" w:color="C9D8C3" w:sz="4"/>
+              <w:left w:val="single" w:color="C9D8C3" w:sz="4"/>
+              <w:bottom w:val="single" w:color="C9D8C3" w:sz="4"/>
+              <w:right w:val="single" w:color="C9D8C3" w:sz="4"/>
+            </w:tcBorders>
+            <w:tcMar>
+              <w:top w:type="dxa" w:w="70"/>
+              <w:left w:type="dxa" w:w="110"/>
+              <w:bottom w:type="dxa" w:w="70"/>
+              <w:right w:type="dxa" w:w="110"/>
+            </w:tcMar>
+          </w:tcPr>
+          <w:p>
+            <w:r>
+              <w:rPr>
+                <w:rFonts w:ascii="Consolas" w:cs="Consolas" w:eastAsia="Consolas" w:hAnsi="Consolas"/>
+                <w:color w:val="254229"/>
+                <w:sz w:val="20"/>
+                <w:szCs w:val="20"/>
+              </w:rPr>
+              <w:t xml:space="preserve">GET /api/patients?therapist_id=</w:t>
+            </w:r>
+            <w:r>
+              <w:t xml:space="preserve"> · </w:t>
+            </w:r>
+            <w:r>
+              <w:rPr>
+                <w:rFonts w:ascii="Consolas" w:cs="Consolas" w:eastAsia="Consolas" w:hAnsi="Consolas"/>
+                <w:color w:val="254229"/>
+                <w:sz w:val="20"/>
+                <w:szCs w:val="20"/>
+              </w:rPr>
+              <w:t xml:space="preserve">GET /api/patients/{id}</w:t>
+            </w:r>
+          </w:p>
+        </w:tc>
+      </w:tr>
+      <w:tr>
+        <w:trPr>
+          <w:cantSplit/>
+        </w:trPr>
+        <w:tc>
+          <w:tcPr>
+            <w:tcW w:type="dxa" w:w="3600"/>
+            <w:tcBorders>
+              <w:top w:val="single" w:color="C9D8C3" w:sz="4"/>
+              <w:left w:val="single" w:color="C9D8C3" w:sz="4"/>
+              <w:bottom w:val="single" w:color="C9D8C3" w:sz="4"/>
+              <w:right w:val="single" w:color="C9D8C3" w:sz="4"/>
+            </w:tcBorders>
+            <w:shd w:fill="F6F9F4" w:color="auto" w:val="clear"/>
+            <w:tcMar>
+              <w:top w:type="dxa" w:w="70"/>
+              <w:left w:type="dxa" w:w="110"/>
+              <w:bottom w:type="dxa" w:w="70"/>
+              <w:right w:type="dxa" w:w="110"/>
+            </w:tcMar>
+          </w:tcPr>
+          <w:p>
+            <w:r>
+              <w:t xml:space="preserve">Vitals → Start Session</w:t>
+            </w:r>
+          </w:p>
+        </w:tc>
+        <w:tc>
+          <w:tcPr>
+            <w:tcW w:type="dxa" w:w="5426"/>
+            <w:tcBorders>
+              <w:top w:val="single" w:color="C9D8C3" w:sz="4"/>
+              <w:left w:val="single" w:color="C9D8C3" w:sz="4"/>
+              <w:bottom w:val="single" w:color="C9D8C3" w:sz="4"/>
+              <w:right w:val="single" w:color="C9D8C3" w:sz="4"/>
+            </w:tcBorders>
+            <w:shd w:fill="F6F9F4" w:color="auto" w:val="clear"/>
+            <w:tcMar>
+              <w:top w:type="dxa" w:w="70"/>
+              <w:left w:type="dxa" w:w="110"/>
+              <w:bottom w:type="dxa" w:w="70"/>
+              <w:right w:type="dxa" w:w="110"/>
+            </w:tcMar>
+          </w:tcPr>
+          <w:p>
+            <w:r>
+              <w:rPr>
+                <w:rFonts w:ascii="Consolas" w:cs="Consolas" w:eastAsia="Consolas" w:hAnsi="Consolas"/>
+                <w:color w:val="254229"/>
+                <w:sz w:val="20"/>
+                <w:szCs w:val="20"/>
+              </w:rPr>
+              <w:t xml:space="preserve">POST /api/sessions</w:t>
+            </w:r>
+            <w:r>
+              <w:t xml:space="preserve"> (returns the session_id)</w:t>
+            </w:r>
+          </w:p>
+        </w:tc>
+      </w:tr>
+      <w:tr>
+        <w:trPr>
+          <w:cantSplit/>
+        </w:trPr>
+        <w:tc>
+          <w:tcPr>
+            <w:tcW w:type="dxa" w:w="3600"/>
+            <w:tcBorders>
+              <w:top w:val="single" w:color="C9D8C3" w:sz="4"/>
+              <w:left w:val="single" w:color="C9D8C3" w:sz="4"/>
+              <w:bottom w:val="single" w:color="C9D8C3" w:sz="4"/>
+              <w:right w:val="single" w:color="C9D8C3" w:sz="4"/>
+            </w:tcBorders>
+            <w:tcMar>
+              <w:top w:type="dxa" w:w="70"/>
+              <w:left w:type="dxa" w:w="110"/>
+              <w:bottom w:type="dxa" w:w="70"/>
+              <w:right w:type="dxa" w:w="110"/>
+            </w:tcMar>
+          </w:tcPr>
+          <w:p>
+            <w:r>
+              <w:t xml:space="preserve">Lift, movement, unloading</w:t>
+            </w:r>
+          </w:p>
+        </w:tc>
+        <w:tc>
+          <w:tcPr>
+            <w:tcW w:type="dxa" w:w="5426"/>
+            <w:tcBorders>
+              <w:top w:val="single" w:color="C9D8C3" w:sz="4"/>
+              <w:left w:val="single" w:color="C9D8C3" w:sz="4"/>
+              <w:bottom w:val="single" w:color="C9D8C3" w:sz="4"/>
+              <w:right w:val="single" w:color="C9D8C3" w:sz="4"/>
+            </w:tcBorders>
+            <w:tcMar>
+              <w:top w:type="dxa" w:w="70"/>
+              <w:left w:type="dxa" w:w="110"/>
+              <w:bottom w:type="dxa" w:w="70"/>
+              <w:right w:type="dxa" w:w="110"/>
+            </w:tcMar>
+          </w:tcPr>
+          <w:p>
+            <w:r>
+              <w:rPr>
+                <w:rFonts w:ascii="Consolas" w:cs="Consolas" w:eastAsia="Consolas" w:hAnsi="Consolas"/>
+                <w:color w:val="254229"/>
+                <w:sz w:val="20"/>
+                <w:szCs w:val="20"/>
+              </w:rPr>
+              <w:t xml:space="preserve">POST /api/device/control</w:t>
+            </w:r>
+          </w:p>
+        </w:tc>
+      </w:tr>
+      <w:tr>
+        <w:trPr>
+          <w:cantSplit/>
+        </w:trPr>
+        <w:tc>
+          <w:tcPr>
+            <w:tcW w:type="dxa" w:w="3600"/>
+            <w:tcBorders>
+              <w:top w:val="single" w:color="C9D8C3" w:sz="4"/>
+              <w:left w:val="single" w:color="C9D8C3" w:sz="4"/>
+              <w:bottom w:val="single" w:color="C9D8C3" w:sz="4"/>
+              <w:right w:val="single" w:color="C9D8C3" w:sz="4"/>
+            </w:tcBorders>
+            <w:shd w:fill="F6F9F4" w:color="auto" w:val="clear"/>
+            <w:tcMar>
+              <w:top w:type="dxa" w:w="70"/>
+              <w:left w:type="dxa" w:w="110"/>
+              <w:bottom w:type="dxa" w:w="70"/>
+              <w:right w:type="dxa" w:w="110"/>
+            </w:tcMar>
+          </w:tcPr>
+          <w:p>
+            <w:r>
+              <w:t xml:space="preserve">Start session (mode)</w:t>
+            </w:r>
+          </w:p>
+        </w:tc>
+        <w:tc>
+          <w:tcPr>
+            <w:tcW w:type="dxa" w:w="5426"/>
+            <w:tcBorders>
+              <w:top w:val="single" w:color="C9D8C3" w:sz="4"/>
+              <w:left w:val="single" w:color="C9D8C3" w:sz="4"/>
+              <w:bottom w:val="single" w:color="C9D8C3" w:sz="4"/>
+              <w:right w:val="single" w:color="C9D8C3" w:sz="4"/>
+            </w:tcBorders>
+            <w:shd w:fill="F6F9F4" w:color="auto" w:val="clear"/>
+            <w:tcMar>
+              <w:top w:type="dxa" w:w="70"/>
+              <w:left w:type="dxa" w:w="110"/>
+              <w:bottom w:type="dxa" w:w="70"/>
+              <w:right w:type="dxa" w:w="110"/>
+            </w:tcMar>
+          </w:tcPr>
+          <w:p>
+            <w:r>
+              <w:rPr>
+                <w:rFonts w:ascii="Consolas" w:cs="Consolas" w:eastAsia="Consolas" w:hAnsi="Consolas"/>
+                <w:color w:val="254229"/>
+                <w:sz w:val="20"/>
+                <w:szCs w:val="20"/>
+              </w:rPr>
+              <w:t xml:space="preserve">POST /api/sessions/mode</w:t>
+            </w:r>
+          </w:p>
+        </w:tc>
+      </w:tr>
+      <w:tr>
+        <w:trPr>
+          <w:cantSplit/>
+        </w:trPr>
+        <w:tc>
+          <w:tcPr>
+            <w:tcW w:type="dxa" w:w="3600"/>
+            <w:tcBorders>
+              <w:top w:val="single" w:color="C9D8C3" w:sz="4"/>
+              <w:left w:val="single" w:color="C9D8C3" w:sz="4"/>
+              <w:bottom w:val="single" w:color="C9D8C3" w:sz="4"/>
+              <w:right w:val="single" w:color="C9D8C3" w:sz="4"/>
+            </w:tcBorders>
+            <w:tcMar>
+              <w:top w:type="dxa" w:w="70"/>
+              <w:left w:type="dxa" w:w="110"/>
+              <w:bottom w:type="dxa" w:w="70"/>
+              <w:right w:type="dxa" w:w="110"/>
+            </w:tcMar>
+          </w:tcPr>
+          <w:p>
+            <w:r>
+              <w:t xml:space="preserve">Ongoing session (polled)</w:t>
+            </w:r>
+          </w:p>
+        </w:tc>
+        <w:tc>
+          <w:tcPr>
+            <w:tcW w:type="dxa" w:w="5426"/>
+            <w:tcBorders>
+              <w:top w:val="single" w:color="C9D8C3" w:sz="4"/>
+              <w:left w:val="single" w:color="C9D8C3" w:sz="4"/>
+              <w:bottom w:val="single" w:color="C9D8C3" w:sz="4"/>
+              <w:right w:val="single" w:color="C9D8C3" w:sz="4"/>
+            </w:tcBorders>
+            <w:tcMar>
+              <w:top w:type="dxa" w:w="70"/>
+              <w:left w:type="dxa" w:w="110"/>
+              <w:bottom w:type="dxa" w:w="70"/>
+              <w:right w:type="dxa" w:w="110"/>
+            </w:tcMar>
+          </w:tcPr>
+          <w:p>
+            <w:r>
+              <w:rPr>
+                <w:rFonts w:ascii="Consolas" w:cs="Consolas" w:eastAsia="Consolas" w:hAnsi="Consolas"/>
+                <w:color w:val="254229"/>
+                <w:sz w:val="20"/>
+                <w:szCs w:val="20"/>
+              </w:rPr>
+              <w:t xml:space="preserve">GET /api/device/status</w:t>
+            </w:r>
+          </w:p>
+        </w:tc>
+      </w:tr>
+      <w:tr>
+        <w:trPr>
+          <w:cantSplit/>
+        </w:trPr>
+        <w:tc>
+          <w:tcPr>
+            <w:tcW w:type="dxa" w:w="3600"/>
+            <w:tcBorders>
+              <w:top w:val="single" w:color="C9D8C3" w:sz="4"/>
+              <w:left w:val="single" w:color="C9D8C3" w:sz="4"/>
+              <w:bottom w:val="single" w:color="C9D8C3" w:sz="4"/>
+              <w:right w:val="single" w:color="C9D8C3" w:sz="4"/>
+            </w:tcBorders>
+            <w:shd w:fill="F6F9F4" w:color="auto" w:val="clear"/>
+            <w:tcMar>
+              <w:top w:type="dxa" w:w="70"/>
+              <w:left w:type="dxa" w:w="110"/>
+              <w:bottom w:type="dxa" w:w="70"/>
+              <w:right w:type="dxa" w:w="110"/>
+            </w:tcMar>
+          </w:tcPr>
+          <w:p>
+            <w:r>
+              <w:t xml:space="preserve">E-stop / release</w:t>
+            </w:r>
+          </w:p>
+        </w:tc>
+        <w:tc>
+          <w:tcPr>
+            <w:tcW w:type="dxa" w:w="5426"/>
+            <w:tcBorders>
+              <w:top w:val="single" w:color="C9D8C3" w:sz="4"/>
+              <w:left w:val="single" w:color="C9D8C3" w:sz="4"/>
+              <w:bottom w:val="single" w:color="C9D8C3" w:sz="4"/>
+              <w:right w:val="single" w:color="C9D8C3" w:sz="4"/>
+            </w:tcBorders>
+            <w:shd w:fill="F6F9F4" w:color="auto" w:val="clear"/>
+            <w:tcMar>
+              <w:top w:type="dxa" w:w="70"/>
+              <w:left w:type="dxa" w:w="110"/>
+              <w:bottom w:type="dxa" w:w="70"/>
+              <w:right w:type="dxa" w:w="110"/>
+            </w:tcMar>
+          </w:tcPr>
+          <w:p>
+            <w:r>
+              <w:rPr>
+                <w:rFonts w:ascii="Consolas" w:cs="Consolas" w:eastAsia="Consolas" w:hAnsi="Consolas"/>
+                <w:color w:val="254229"/>
+                <w:sz w:val="20"/>
+                <w:szCs w:val="20"/>
+              </w:rPr>
+              <w:t xml:space="preserve">POST /api/device/estop</w:t>
+            </w:r>
+            <w:r>
+              <w:t xml:space="preserve"> (</w:t>
+            </w:r>
+            <w:r>
+              <w:rPr>
+                <w:rFonts w:ascii="Consolas" w:cs="Consolas" w:eastAsia="Consolas" w:hAnsi="Consolas"/>
+                <w:color w:val="254229"/>
+                <w:sz w:val="20"/>
+                <w:szCs w:val="20"/>
+              </w:rPr>
+              <w:t xml:space="preserve">soft_brake</w:t>
+            </w:r>
+            <w:r>
+              <w:t xml:space="preserve"> true / false)</w:t>
+            </w:r>
+          </w:p>
+        </w:tc>
+      </w:tr>
+      <w:tr>
+        <w:trPr>
+          <w:cantSplit/>
+        </w:trPr>
+        <w:tc>
+          <w:tcPr>
+            <w:tcW w:type="dxa" w:w="3600"/>
+            <w:tcBorders>
+              <w:top w:val="single" w:color="C9D8C3" w:sz="4"/>
+              <w:left w:val="single" w:color="C9D8C3" w:sz="4"/>
+              <w:bottom w:val="single" w:color="C9D8C3" w:sz="4"/>
+              <w:right w:val="single" w:color="C9D8C3" w:sz="4"/>
+            </w:tcBorders>
+            <w:tcMar>
+              <w:top w:type="dxa" w:w="70"/>
+              <w:left w:type="dxa" w:w="110"/>
+              <w:bottom w:type="dxa" w:w="70"/>
+              <w:right w:type="dxa" w:w="110"/>
+            </w:tcMar>
+          </w:tcPr>
+          <w:p>
+            <w:r>
+              <w:t xml:space="preserve">Break / resume / end</w:t>
+            </w:r>
+          </w:p>
+        </w:tc>
+        <w:tc>
+          <w:tcPr>
+            <w:tcW w:type="dxa" w:w="5426"/>
+            <w:tcBorders>
+              <w:top w:val="single" w:color="C9D8C3" w:sz="4"/>
+              <w:left w:val="single" w:color="C9D8C3" w:sz="4"/>
+              <w:bottom w:val="single" w:color="C9D8C3" w:sz="4"/>
+              <w:right w:val="single" w:color="C9D8C3" w:sz="4"/>
+            </w:tcBorders>
+            <w:tcMar>
+              <w:top w:type="dxa" w:w="70"/>
+              <w:left w:type="dxa" w:w="110"/>
+              <w:bottom w:type="dxa" w:w="70"/>
+              <w:right w:type="dxa" w:w="110"/>
+            </w:tcMar>
+          </w:tcPr>
+          <w:p>
+            <w:r>
+              <w:rPr>
+                <w:rFonts w:ascii="Consolas" w:cs="Consolas" w:eastAsia="Consolas" w:hAnsi="Consolas"/>
+                <w:color w:val="254229"/>
+                <w:sz w:val="20"/>
+                <w:szCs w:val="20"/>
+              </w:rPr>
+              <w:t xml:space="preserve">POST /api/sessions/break</w:t>
+            </w:r>
+            <w:r>
+              <w:t xml:space="preserve"> · </w:t>
+            </w:r>
+            <w:r>
+              <w:rPr>
+                <w:rFonts w:ascii="Consolas" w:cs="Consolas" w:eastAsia="Consolas" w:hAnsi="Consolas"/>
+                <w:color w:val="254229"/>
+                <w:sz w:val="20"/>
+                <w:szCs w:val="20"/>
+              </w:rPr>
+              <w:t xml:space="preserve">/resume</w:t>
+            </w:r>
+            <w:r>
+              <w:t xml:space="preserve"> · </w:t>
+            </w:r>
+            <w:r>
+              <w:rPr>
+                <w:rFonts w:ascii="Consolas" w:cs="Consolas" w:eastAsia="Consolas" w:hAnsi="Consolas"/>
+                <w:color w:val="254229"/>
+                <w:sz w:val="20"/>
+                <w:szCs w:val="20"/>
+              </w:rPr>
+              <w:t xml:space="preserve">/end</w:t>
+            </w:r>
+          </w:p>
+        </w:tc>
+      </w:tr>
+      <w:tr>
+        <w:trPr>
+          <w:cantSplit/>
+        </w:trPr>
+        <w:tc>
+          <w:tcPr>
+            <w:tcW w:type="dxa" w:w="3600"/>
+            <w:tcBorders>
+              <w:top w:val="single" w:color="C9D8C3" w:sz="4"/>
+              <w:left w:val="single" w:color="C9D8C3" w:sz="4"/>
+              <w:bottom w:val="single" w:color="C9D8C3" w:sz="4"/>
+              <w:right w:val="single" w:color="C9D8C3" w:sz="4"/>
+            </w:tcBorders>
+            <w:shd w:fill="F6F9F4" w:color="auto" w:val="clear"/>
+            <w:tcMar>
+              <w:top w:type="dxa" w:w="70"/>
+              <w:left w:type="dxa" w:w="110"/>
+              <w:bottom w:type="dxa" w:w="70"/>
+              <w:right w:type="dxa" w:w="110"/>
+            </w:tcMar>
+          </w:tcPr>
+          <w:p>
+            <w:r>
+              <w:t xml:space="preserve">Save session report</w:t>
+            </w:r>
+          </w:p>
+        </w:tc>
+        <w:tc>
+          <w:tcPr>
+            <w:tcW w:type="dxa" w:w="5426"/>
+            <w:tcBorders>
+              <w:top w:val="single" w:color="C9D8C3" w:sz="4"/>
+              <w:left w:val="single" w:color="C9D8C3" w:sz="4"/>
+              <w:bottom w:val="single" w:color="C9D8C3" w:sz="4"/>
+              <w:right w:val="single" w:color="C9D8C3" w:sz="4"/>
+            </w:tcBorders>
+            <w:shd w:fill="F6F9F4" w:color="auto" w:val="clear"/>
+            <w:tcMar>
+              <w:top w:type="dxa" w:w="70"/>
+              <w:left w:type="dxa" w:w="110"/>
+              <w:bottom w:type="dxa" w:w="70"/>
+              <w:right w:type="dxa" w:w="110"/>
+            </w:tcMar>
+          </w:tcPr>
+          <w:p>
+            <w:r>
+              <w:rPr>
+                <w:rFonts w:ascii="Consolas" w:cs="Consolas" w:eastAsia="Consolas" w:hAnsi="Consolas"/>
+                <w:color w:val="254229"/>
+                <w:sz w:val="20"/>
+                <w:szCs w:val="20"/>
+              </w:rPr>
+              <w:t xml:space="preserve">POST /api/sessions/{id}/report</w:t>
+            </w:r>
+          </w:p>
+        </w:tc>
+      </w:tr>
+    </w:tbl>
+    <w:p>
+      <w:pPr>
+        <w:spacing w:after="120"/>
+      </w:pPr>
+      <w:r>
+        <w:t xml:space="preserve">Every response has </w:t>
+      </w:r>
+      <w:r>
+        <w:rPr>
+          <w:rFonts w:ascii="Consolas" w:cs="Consolas" w:eastAsia="Consolas" w:hAnsi="Consolas"/>
+          <w:color w:val="254229"/>
+          <w:sz w:val="20"/>
+          <w:szCs w:val="20"/>
+        </w:rPr>
+        <w:t xml:space="preserve">"status": "success"</w:t>
+      </w:r>
+      <w:r>
+        <w:t xml:space="preserve">, or </w:t>
+      </w:r>
+      <w:r>
+        <w:rPr>
+          <w:rFonts w:ascii="Consolas" w:cs="Consolas" w:eastAsia="Consolas" w:hAnsi="Consolas"/>
+          <w:color w:val="254229"/>
+          <w:sz w:val="20"/>
+          <w:szCs w:val="20"/>
+        </w:rPr>
+        <w:t xml:space="preserve">"status": "error"</w:t>
+      </w:r>
+      <w:r>
+        <w:t xml:space="preserve"> with a </w:t>
+      </w:r>
+      <w:r>
+        <w:rPr>
+          <w:rFonts w:ascii="Consolas" w:cs="Consolas" w:eastAsia="Consolas" w:hAnsi="Consolas"/>
+          <w:color w:val="254229"/>
+          <w:sz w:val="20"/>
+          <w:szCs w:val="20"/>
+        </w:rPr>
+        <w:t xml:space="preserve">code</w:t>
+      </w:r>
+      <w:r>
+        <w:t xml:space="preserve"> and </w:t>
+      </w:r>
+      <w:r>
+        <w:rPr>
+          <w:rFonts w:ascii="Consolas" w:cs="Consolas" w:eastAsia="Consolas" w:hAnsi="Consolas"/>
+          <w:color w:val="254229"/>
+          <w:sz w:val="20"/>
+          <w:szCs w:val="20"/>
+        </w:rPr>
+        <w:t xml:space="preserve">message</w:t>
+      </w:r>
+      <w:r>
+        <w:t xml:space="preserve">. HTTP status: 200/201 when it succeeds, 400 for a missing field, 401 for a wrong login, 404 when something is not found, 409 when it is not allowed right now (for example E-stop engaged), 422 for unloading above 60 kg.</w:t>
       </w:r>
     </w:p>
     <w:sectPr>
@@ -5923,6 +7726,18 @@
     </w:lvl>
   </w:abstractNum>
   <w:abstractNum w:abstractNumId="10" w15:restartNumberingAfterBreak="0">
+    <w:multiLevelType w:val="hybridMultilevel"/>
+    <w:lvl w:ilvl="0" w15:tentative="1">
+      <w:start w:val="1"/>
+      <w:numFmt w:val="decimal"/>
+      <w:lvlText w:val="%1."/>
+      <w:lvlJc w:val="left"/>
+      <w:pPr>
+        <w:ind w:left="720" w:hanging="360"/>
+      </w:pPr>
+    </w:lvl>
+  </w:abstractNum>
+  <w:abstractNum w:abstractNumId="11" w15:restartNumberingAfterBreak="0">
     <w:multiLevelType w:val="hybridMultilevel"/>
     <w:lvl w:ilvl="0" w15:tentative="1">
       <w:start w:val="1"/>
@@ -5984,6 +7799,12 @@
   </w:num>
   <w:num w:numId="9">
     <w:abstractNumId w:val="9"/>
+    <w:lvlOverride w:ilvl="0">
+      <w:startOverride w:val="1"/>
+    </w:lvlOverride>
+  </w:num>
+  <w:num w:numId="10">
+    <w:abstractNumId w:val="11"/>
     <w:lvlOverride w:ilvl="0">
       <w:startOverride w:val="1"/>
     </w:lvlOverride>

</xml_diff>